<commit_message>
fix aspect ratio bug standalone
</commit_message>
<xml_diff>
--- a/tests/stats_merged_quiz_multimodal.docx
+++ b/tests/stats_merged_quiz_multimodal.docx
@@ -4,7 +4,6 @@
   <w:body>
     <w:p>
       <w:pPr>
-        <w:pStyle w:val="Heading1"/>
         <w:keepNext/>
         <w:spacing w:before="320" w:after="80"/>
         <w:jc w:val="center"/>
@@ -14,11 +13,33 @@
           <w:b/>
           <w:i w:val="0"/>
           <w:strike w:val="0"/>
-          <w:color w:val="1F4E79"/>
-          <w:sz w:val="40"/>
+          <w:color w:val="111111"/>
+          <w:sz w:val="28"/>
           <w:u w:val="none"/>
         </w:rPr>
-        <w:t>2011 AP® STATISTICS FREE-RESPONSE QUESTIONS</w:t>
+        <w:t>2011 AP</w:t>
+      </w:r>
+      <w:r>
+        <w:rPr>
+          <w:b/>
+          <w:i w:val="0"/>
+          <w:strike w:val="0"/>
+          <w:color w:val="111111"/>
+          <w:sz w:val="36"/>
+          <w:u w:val="none"/>
+        </w:rPr>
+        <w:t>®</w:t>
+      </w:r>
+      <w:r>
+        <w:rPr>
+          <w:b/>
+          <w:i w:val="0"/>
+          <w:strike w:val="0"/>
+          <w:color w:val="111111"/>
+          <w:sz w:val="28"/>
+          <w:u w:val="none"/>
+        </w:rPr>
+        <w:t xml:space="preserve"> STATISTICS FREE-RESPONSE QUESTIONS</w:t>
       </w:r>
     </w:p>
     <w:p>
@@ -29,14 +50,20 @@
           <w:strike w:val="0"/>
           <w:u w:val="none"/>
         </w:rPr>
-        <w:t>2. The table below shows the political party registration by gender of all 500 registered voters in Franklin Township.</w:t>
+        <w:t xml:space="preserve">2. </w:t>
+      </w:r>
+      <w:r>
+        <w:rPr>
+          <w:b w:val="0"/>
+          <w:i w:val="0"/>
+          <w:strike w:val="0"/>
+          <w:u w:val="none"/>
+        </w:rPr>
+        <w:t>The table below shows the political party registration by gender of all 500 registered voters in Franklin Township.</w:t>
       </w:r>
     </w:p>
     <w:p>
       <w:pPr>
-        <w:pStyle w:val="Heading3"/>
-        <w:keepNext/>
-        <w:spacing w:before="240" w:after="80"/>
         <w:jc w:val="center"/>
       </w:pPr>
       <w:r>
@@ -44,8 +71,6 @@
           <w:b w:val="0"/>
           <w:i w:val="0"/>
           <w:strike w:val="0"/>
-          <w:color w:val="1F4E79"/>
-          <w:sz w:val="32"/>
           <w:u w:val="none"/>
         </w:rPr>
         <w:t>PARTY REGISTRATION–FRANKLIN TOWNSHIP</w:t>
@@ -56,6 +81,14 @@
         <w:tblW w:type="auto" w:w="0"/>
         <w:jc w:val="center"/>
         <w:tblLook w:firstColumn="1" w:firstRow="1" w:lastColumn="0" w:lastRow="0" w:noHBand="0" w:noVBand="1" w:val="04A0"/>
+        <w:tblBorders>
+          <w:top w:val="single" w:sz="4" w:space="0" w:color="444444"/>
+          <w:left w:val="single" w:sz="4" w:space="0" w:color="444444"/>
+          <w:bottom w:val="single" w:sz="4" w:space="0" w:color="444444"/>
+          <w:right w:val="single" w:sz="4" w:space="0" w:color="444444"/>
+          <w:insideH w:val="single" w:sz="4" w:space="0" w:color="444444"/>
+          <w:insideV w:val="single" w:sz="4" w:space="0" w:color="444444"/>
+        </w:tblBorders>
       </w:tblPr>
       <w:tblGrid>
         <w:gridCol w:w="1728"/>
@@ -74,30 +107,24 @@
             <w:tcW w:type="dxa" w:w="1872"/>
             <w:vAlign w:val="center"/>
             <w:tcMar>
-              <w:top w:w="120" w:type="dxa"/>
-              <w:bottom w:w="120" w:type="dxa"/>
-              <w:left w:w="140" w:type="dxa"/>
-              <w:right w:w="140" w:type="dxa"/>
+              <w:top w:w="70" w:type="dxa"/>
+              <w:bottom w:w="70" w:type="dxa"/>
+              <w:left w:w="100" w:type="dxa"/>
+              <w:right w:w="100" w:type="dxa"/>
             </w:tcMar>
-            <w:shd w:fill="1F4E79" w:val="clear"/>
+            <w:shd w:fill="F2F4F7" w:val="clear"/>
           </w:tcPr>
           <w:p>
             <w:pPr>
               <w:spacing w:before="0" w:after="0" w:line="240" w:lineRule="auto"/>
+              <w:jc w:val="center"/>
             </w:pPr>
             <w:r/>
             <w:r>
               <w:rPr>
                 <w:b/>
-                <w:color w:val="FFFFFF"/>
-                <w:sz w:val="20"/>
-              </w:rPr>
-            </w:r>
-            <w:r>
-              <w:rPr>
-                <w:b/>
-                <w:color w:val="FFFFFF"/>
-                <w:sz w:val="20"/>
+                <w:color w:val="000000"/>
+                <w:sz w:val="19"/>
               </w:rPr>
             </w:r>
           </w:p>
@@ -107,31 +134,24 @@
             <w:tcW w:type="dxa" w:w="1872"/>
             <w:vAlign w:val="center"/>
             <w:tcMar>
-              <w:top w:w="120" w:type="dxa"/>
-              <w:bottom w:w="120" w:type="dxa"/>
-              <w:left w:w="140" w:type="dxa"/>
-              <w:right w:w="140" w:type="dxa"/>
+              <w:top w:w="70" w:type="dxa"/>
+              <w:bottom w:w="70" w:type="dxa"/>
+              <w:left w:w="100" w:type="dxa"/>
+              <w:right w:w="100" w:type="dxa"/>
             </w:tcMar>
-            <w:shd w:fill="1F4E79" w:val="clear"/>
+            <w:shd w:fill="F2F4F7" w:val="clear"/>
           </w:tcPr>
           <w:p>
             <w:pPr>
               <w:spacing w:before="0" w:after="0" w:line="240" w:lineRule="auto"/>
+              <w:jc w:val="center"/>
             </w:pPr>
             <w:r/>
             <w:r>
               <w:rPr>
                 <w:b/>
-                <w:color w:val="FFFFFF"/>
-                <w:sz w:val="20"/>
-              </w:rPr>
-              <w:t>Party W</w:t>
-            </w:r>
-            <w:r>
-              <w:rPr>
-                <w:b/>
-                <w:color w:val="FFFFFF"/>
-                <w:sz w:val="20"/>
+                <w:color w:val="000000"/>
+                <w:sz w:val="19"/>
               </w:rPr>
               <w:t>Party W</w:t>
             </w:r>
@@ -142,31 +162,24 @@
             <w:tcW w:type="dxa" w:w="1872"/>
             <w:vAlign w:val="center"/>
             <w:tcMar>
-              <w:top w:w="120" w:type="dxa"/>
-              <w:bottom w:w="120" w:type="dxa"/>
-              <w:left w:w="140" w:type="dxa"/>
-              <w:right w:w="140" w:type="dxa"/>
+              <w:top w:w="70" w:type="dxa"/>
+              <w:bottom w:w="70" w:type="dxa"/>
+              <w:left w:w="100" w:type="dxa"/>
+              <w:right w:w="100" w:type="dxa"/>
             </w:tcMar>
-            <w:shd w:fill="1F4E79" w:val="clear"/>
+            <w:shd w:fill="F2F4F7" w:val="clear"/>
           </w:tcPr>
           <w:p>
             <w:pPr>
               <w:spacing w:before="0" w:after="0" w:line="240" w:lineRule="auto"/>
+              <w:jc w:val="center"/>
             </w:pPr>
             <w:r/>
             <w:r>
               <w:rPr>
                 <w:b/>
-                <w:color w:val="FFFFFF"/>
-                <w:sz w:val="20"/>
-              </w:rPr>
-              <w:t>Party X</w:t>
-            </w:r>
-            <w:r>
-              <w:rPr>
-                <w:b/>
-                <w:color w:val="FFFFFF"/>
-                <w:sz w:val="20"/>
+                <w:color w:val="000000"/>
+                <w:sz w:val="19"/>
               </w:rPr>
               <w:t>Party X</w:t>
             </w:r>
@@ -177,31 +190,24 @@
             <w:tcW w:type="dxa" w:w="1872"/>
             <w:vAlign w:val="center"/>
             <w:tcMar>
-              <w:top w:w="120" w:type="dxa"/>
-              <w:bottom w:w="120" w:type="dxa"/>
-              <w:left w:w="140" w:type="dxa"/>
-              <w:right w:w="140" w:type="dxa"/>
+              <w:top w:w="70" w:type="dxa"/>
+              <w:bottom w:w="70" w:type="dxa"/>
+              <w:left w:w="100" w:type="dxa"/>
+              <w:right w:w="100" w:type="dxa"/>
             </w:tcMar>
-            <w:shd w:fill="1F4E79" w:val="clear"/>
+            <w:shd w:fill="F2F4F7" w:val="clear"/>
           </w:tcPr>
           <w:p>
             <w:pPr>
               <w:spacing w:before="0" w:after="0" w:line="240" w:lineRule="auto"/>
+              <w:jc w:val="center"/>
             </w:pPr>
             <w:r/>
             <w:r>
               <w:rPr>
                 <w:b/>
-                <w:color w:val="FFFFFF"/>
-                <w:sz w:val="20"/>
-              </w:rPr>
-              <w:t>Party Y</w:t>
-            </w:r>
-            <w:r>
-              <w:rPr>
-                <w:b/>
-                <w:color w:val="FFFFFF"/>
-                <w:sz w:val="20"/>
+                <w:color w:val="000000"/>
+                <w:sz w:val="19"/>
               </w:rPr>
               <w:t>Party Y</w:t>
             </w:r>
@@ -212,31 +218,24 @@
             <w:tcW w:type="dxa" w:w="1872"/>
             <w:vAlign w:val="center"/>
             <w:tcMar>
-              <w:top w:w="120" w:type="dxa"/>
-              <w:bottom w:w="120" w:type="dxa"/>
-              <w:left w:w="140" w:type="dxa"/>
-              <w:right w:w="140" w:type="dxa"/>
+              <w:top w:w="70" w:type="dxa"/>
+              <w:bottom w:w="70" w:type="dxa"/>
+              <w:left w:w="100" w:type="dxa"/>
+              <w:right w:w="100" w:type="dxa"/>
             </w:tcMar>
-            <w:shd w:fill="1F4E79" w:val="clear"/>
+            <w:shd w:fill="F2F4F7" w:val="clear"/>
           </w:tcPr>
           <w:p>
             <w:pPr>
               <w:spacing w:before="0" w:after="0" w:line="240" w:lineRule="auto"/>
+              <w:jc w:val="center"/>
             </w:pPr>
             <w:r/>
             <w:r>
               <w:rPr>
                 <w:b/>
-                <w:color w:val="FFFFFF"/>
-                <w:sz w:val="20"/>
-              </w:rPr>
-              <w:t>Total</w:t>
-            </w:r>
-            <w:r>
-              <w:rPr>
-                <w:b/>
-                <w:color w:val="FFFFFF"/>
-                <w:sz w:val="20"/>
+                <w:color w:val="000000"/>
+                <w:sz w:val="19"/>
               </w:rPr>
               <w:t>Total</w:t>
             </w:r>
@@ -252,26 +251,22 @@
             <w:tcW w:type="dxa" w:w="1872"/>
             <w:vAlign w:val="center"/>
             <w:tcMar>
-              <w:top w:w="120" w:type="dxa"/>
-              <w:bottom w:w="120" w:type="dxa"/>
-              <w:left w:w="140" w:type="dxa"/>
-              <w:right w:w="140" w:type="dxa"/>
+              <w:top w:w="70" w:type="dxa"/>
+              <w:bottom w:w="70" w:type="dxa"/>
+              <w:left w:w="100" w:type="dxa"/>
+              <w:right w:w="100" w:type="dxa"/>
             </w:tcMar>
-            <w:shd w:fill="F7F9FB" w:val="clear"/>
+            <w:shd w:fill="FAFAFA" w:val="clear"/>
           </w:tcPr>
           <w:p>
             <w:pPr>
               <w:spacing w:before="0" w:after="0" w:line="240" w:lineRule="auto"/>
+              <w:jc w:val="left"/>
             </w:pPr>
             <w:r/>
             <w:r>
               <w:rPr>
-                <w:sz w:val="19"/>
-              </w:rPr>
-              <w:t>Female</w:t>
-            </w:r>
-            <w:r>
-              <w:rPr>
+                <w:color w:val="111111"/>
                 <w:sz w:val="19"/>
               </w:rPr>
               <w:t>Female</w:t>
@@ -283,26 +278,22 @@
             <w:tcW w:type="dxa" w:w="1872"/>
             <w:vAlign w:val="center"/>
             <w:tcMar>
-              <w:top w:w="120" w:type="dxa"/>
-              <w:bottom w:w="120" w:type="dxa"/>
-              <w:left w:w="140" w:type="dxa"/>
-              <w:right w:w="140" w:type="dxa"/>
+              <w:top w:w="70" w:type="dxa"/>
+              <w:bottom w:w="70" w:type="dxa"/>
+              <w:left w:w="100" w:type="dxa"/>
+              <w:right w:w="100" w:type="dxa"/>
             </w:tcMar>
-            <w:shd w:fill="F7F9FB" w:val="clear"/>
+            <w:shd w:fill="FAFAFA" w:val="clear"/>
           </w:tcPr>
           <w:p>
             <w:pPr>
               <w:spacing w:before="0" w:after="0" w:line="240" w:lineRule="auto"/>
+              <w:jc w:val="center"/>
             </w:pPr>
             <w:r/>
             <w:r>
               <w:rPr>
-                <w:sz w:val="19"/>
-              </w:rPr>
-              <w:t>60</w:t>
-            </w:r>
-            <w:r>
-              <w:rPr>
+                <w:color w:val="111111"/>
                 <w:sz w:val="19"/>
               </w:rPr>
               <w:t>60</w:t>
@@ -314,26 +305,22 @@
             <w:tcW w:type="dxa" w:w="1872"/>
             <w:vAlign w:val="center"/>
             <w:tcMar>
-              <w:top w:w="120" w:type="dxa"/>
-              <w:bottom w:w="120" w:type="dxa"/>
-              <w:left w:w="140" w:type="dxa"/>
-              <w:right w:w="140" w:type="dxa"/>
+              <w:top w:w="70" w:type="dxa"/>
+              <w:bottom w:w="70" w:type="dxa"/>
+              <w:left w:w="100" w:type="dxa"/>
+              <w:right w:w="100" w:type="dxa"/>
             </w:tcMar>
-            <w:shd w:fill="F7F9FB" w:val="clear"/>
+            <w:shd w:fill="FAFAFA" w:val="clear"/>
           </w:tcPr>
           <w:p>
             <w:pPr>
               <w:spacing w:before="0" w:after="0" w:line="240" w:lineRule="auto"/>
+              <w:jc w:val="center"/>
             </w:pPr>
             <w:r/>
             <w:r>
               <w:rPr>
-                <w:sz w:val="19"/>
-              </w:rPr>
-              <w:t>120</w:t>
-            </w:r>
-            <w:r>
-              <w:rPr>
+                <w:color w:val="111111"/>
                 <w:sz w:val="19"/>
               </w:rPr>
               <w:t>120</w:t>
@@ -345,26 +332,22 @@
             <w:tcW w:type="dxa" w:w="1872"/>
             <w:vAlign w:val="center"/>
             <w:tcMar>
-              <w:top w:w="120" w:type="dxa"/>
-              <w:bottom w:w="120" w:type="dxa"/>
-              <w:left w:w="140" w:type="dxa"/>
-              <w:right w:w="140" w:type="dxa"/>
+              <w:top w:w="70" w:type="dxa"/>
+              <w:bottom w:w="70" w:type="dxa"/>
+              <w:left w:w="100" w:type="dxa"/>
+              <w:right w:w="100" w:type="dxa"/>
             </w:tcMar>
-            <w:shd w:fill="F7F9FB" w:val="clear"/>
+            <w:shd w:fill="FAFAFA" w:val="clear"/>
           </w:tcPr>
           <w:p>
             <w:pPr>
               <w:spacing w:before="0" w:after="0" w:line="240" w:lineRule="auto"/>
+              <w:jc w:val="center"/>
             </w:pPr>
             <w:r/>
             <w:r>
               <w:rPr>
-                <w:sz w:val="19"/>
-              </w:rPr>
-              <w:t>120</w:t>
-            </w:r>
-            <w:r>
-              <w:rPr>
+                <w:color w:val="111111"/>
                 <w:sz w:val="19"/>
               </w:rPr>
               <w:t>120</w:t>
@@ -376,26 +359,22 @@
             <w:tcW w:type="dxa" w:w="1872"/>
             <w:vAlign w:val="center"/>
             <w:tcMar>
-              <w:top w:w="120" w:type="dxa"/>
-              <w:bottom w:w="120" w:type="dxa"/>
-              <w:left w:w="140" w:type="dxa"/>
-              <w:right w:w="140" w:type="dxa"/>
+              <w:top w:w="70" w:type="dxa"/>
+              <w:bottom w:w="70" w:type="dxa"/>
+              <w:left w:w="100" w:type="dxa"/>
+              <w:right w:w="100" w:type="dxa"/>
             </w:tcMar>
-            <w:shd w:fill="F7F9FB" w:val="clear"/>
+            <w:shd w:fill="FAFAFA" w:val="clear"/>
           </w:tcPr>
           <w:p>
             <w:pPr>
               <w:spacing w:before="0" w:after="0" w:line="240" w:lineRule="auto"/>
+              <w:jc w:val="center"/>
             </w:pPr>
             <w:r/>
             <w:r>
               <w:rPr>
-                <w:sz w:val="19"/>
-              </w:rPr>
-              <w:t>300</w:t>
-            </w:r>
-            <w:r>
-              <w:rPr>
+                <w:color w:val="111111"/>
                 <w:sz w:val="19"/>
               </w:rPr>
               <w:t>300</w:t>
@@ -412,25 +391,21 @@
             <w:tcW w:type="dxa" w:w="1872"/>
             <w:vAlign w:val="center"/>
             <w:tcMar>
-              <w:top w:w="120" w:type="dxa"/>
-              <w:bottom w:w="120" w:type="dxa"/>
-              <w:left w:w="140" w:type="dxa"/>
-              <w:right w:w="140" w:type="dxa"/>
+              <w:top w:w="70" w:type="dxa"/>
+              <w:bottom w:w="70" w:type="dxa"/>
+              <w:left w:w="100" w:type="dxa"/>
+              <w:right w:w="100" w:type="dxa"/>
             </w:tcMar>
           </w:tcPr>
           <w:p>
             <w:pPr>
               <w:spacing w:before="0" w:after="0" w:line="240" w:lineRule="auto"/>
+              <w:jc w:val="left"/>
             </w:pPr>
             <w:r/>
             <w:r>
               <w:rPr>
-                <w:sz w:val="19"/>
-              </w:rPr>
-              <w:t>Male</w:t>
-            </w:r>
-            <w:r>
-              <w:rPr>
+                <w:color w:val="111111"/>
                 <w:sz w:val="19"/>
               </w:rPr>
               <w:t>Male</w:t>
@@ -442,25 +417,21 @@
             <w:tcW w:type="dxa" w:w="1872"/>
             <w:vAlign w:val="center"/>
             <w:tcMar>
-              <w:top w:w="120" w:type="dxa"/>
-              <w:bottom w:w="120" w:type="dxa"/>
-              <w:left w:w="140" w:type="dxa"/>
-              <w:right w:w="140" w:type="dxa"/>
+              <w:top w:w="70" w:type="dxa"/>
+              <w:bottom w:w="70" w:type="dxa"/>
+              <w:left w:w="100" w:type="dxa"/>
+              <w:right w:w="100" w:type="dxa"/>
             </w:tcMar>
           </w:tcPr>
           <w:p>
             <w:pPr>
               <w:spacing w:before="0" w:after="0" w:line="240" w:lineRule="auto"/>
+              <w:jc w:val="center"/>
             </w:pPr>
             <w:r/>
             <w:r>
               <w:rPr>
-                <w:sz w:val="19"/>
-              </w:rPr>
-              <w:t>28</w:t>
-            </w:r>
-            <w:r>
-              <w:rPr>
+                <w:color w:val="111111"/>
                 <w:sz w:val="19"/>
               </w:rPr>
               <w:t>28</w:t>
@@ -472,25 +443,21 @@
             <w:tcW w:type="dxa" w:w="1872"/>
             <w:vAlign w:val="center"/>
             <w:tcMar>
-              <w:top w:w="120" w:type="dxa"/>
-              <w:bottom w:w="120" w:type="dxa"/>
-              <w:left w:w="140" w:type="dxa"/>
-              <w:right w:w="140" w:type="dxa"/>
+              <w:top w:w="70" w:type="dxa"/>
+              <w:bottom w:w="70" w:type="dxa"/>
+              <w:left w:w="100" w:type="dxa"/>
+              <w:right w:w="100" w:type="dxa"/>
             </w:tcMar>
           </w:tcPr>
           <w:p>
             <w:pPr>
               <w:spacing w:before="0" w:after="0" w:line="240" w:lineRule="auto"/>
+              <w:jc w:val="center"/>
             </w:pPr>
             <w:r/>
             <w:r>
               <w:rPr>
-                <w:sz w:val="19"/>
-              </w:rPr>
-              <w:t>124</w:t>
-            </w:r>
-            <w:r>
-              <w:rPr>
+                <w:color w:val="111111"/>
                 <w:sz w:val="19"/>
               </w:rPr>
               <w:t>124</w:t>
@@ -502,25 +469,21 @@
             <w:tcW w:type="dxa" w:w="1872"/>
             <w:vAlign w:val="center"/>
             <w:tcMar>
-              <w:top w:w="120" w:type="dxa"/>
-              <w:bottom w:w="120" w:type="dxa"/>
-              <w:left w:w="140" w:type="dxa"/>
-              <w:right w:w="140" w:type="dxa"/>
+              <w:top w:w="70" w:type="dxa"/>
+              <w:bottom w:w="70" w:type="dxa"/>
+              <w:left w:w="100" w:type="dxa"/>
+              <w:right w:w="100" w:type="dxa"/>
             </w:tcMar>
           </w:tcPr>
           <w:p>
             <w:pPr>
               <w:spacing w:before="0" w:after="0" w:line="240" w:lineRule="auto"/>
+              <w:jc w:val="center"/>
             </w:pPr>
             <w:r/>
             <w:r>
               <w:rPr>
-                <w:sz w:val="19"/>
-              </w:rPr>
-              <w:t>48</w:t>
-            </w:r>
-            <w:r>
-              <w:rPr>
+                <w:color w:val="111111"/>
                 <w:sz w:val="19"/>
               </w:rPr>
               <w:t>48</w:t>
@@ -532,25 +495,21 @@
             <w:tcW w:type="dxa" w:w="1872"/>
             <w:vAlign w:val="center"/>
             <w:tcMar>
-              <w:top w:w="120" w:type="dxa"/>
-              <w:bottom w:w="120" w:type="dxa"/>
-              <w:left w:w="140" w:type="dxa"/>
-              <w:right w:w="140" w:type="dxa"/>
+              <w:top w:w="70" w:type="dxa"/>
+              <w:bottom w:w="70" w:type="dxa"/>
+              <w:left w:w="100" w:type="dxa"/>
+              <w:right w:w="100" w:type="dxa"/>
             </w:tcMar>
           </w:tcPr>
           <w:p>
             <w:pPr>
               <w:spacing w:before="0" w:after="0" w:line="240" w:lineRule="auto"/>
+              <w:jc w:val="center"/>
             </w:pPr>
             <w:r/>
             <w:r>
               <w:rPr>
-                <w:sz w:val="19"/>
-              </w:rPr>
-              <w:t>200</w:t>
-            </w:r>
-            <w:r>
-              <w:rPr>
+                <w:color w:val="111111"/>
                 <w:sz w:val="19"/>
               </w:rPr>
               <w:t>200</w:t>
@@ -567,26 +526,22 @@
             <w:tcW w:type="dxa" w:w="1872"/>
             <w:vAlign w:val="center"/>
             <w:tcMar>
-              <w:top w:w="120" w:type="dxa"/>
-              <w:bottom w:w="120" w:type="dxa"/>
-              <w:left w:w="140" w:type="dxa"/>
-              <w:right w:w="140" w:type="dxa"/>
+              <w:top w:w="70" w:type="dxa"/>
+              <w:bottom w:w="70" w:type="dxa"/>
+              <w:left w:w="100" w:type="dxa"/>
+              <w:right w:w="100" w:type="dxa"/>
             </w:tcMar>
-            <w:shd w:fill="F7F9FB" w:val="clear"/>
+            <w:shd w:fill="FAFAFA" w:val="clear"/>
           </w:tcPr>
           <w:p>
             <w:pPr>
               <w:spacing w:before="0" w:after="0" w:line="240" w:lineRule="auto"/>
+              <w:jc w:val="left"/>
             </w:pPr>
             <w:r/>
             <w:r>
               <w:rPr>
-                <w:sz w:val="19"/>
-              </w:rPr>
-              <w:t>Total</w:t>
-            </w:r>
-            <w:r>
-              <w:rPr>
+                <w:color w:val="111111"/>
                 <w:sz w:val="19"/>
               </w:rPr>
               <w:t>Total</w:t>
@@ -598,26 +553,22 @@
             <w:tcW w:type="dxa" w:w="1872"/>
             <w:vAlign w:val="center"/>
             <w:tcMar>
-              <w:top w:w="120" w:type="dxa"/>
-              <w:bottom w:w="120" w:type="dxa"/>
-              <w:left w:w="140" w:type="dxa"/>
-              <w:right w:w="140" w:type="dxa"/>
+              <w:top w:w="70" w:type="dxa"/>
+              <w:bottom w:w="70" w:type="dxa"/>
+              <w:left w:w="100" w:type="dxa"/>
+              <w:right w:w="100" w:type="dxa"/>
             </w:tcMar>
-            <w:shd w:fill="F7F9FB" w:val="clear"/>
+            <w:shd w:fill="FAFAFA" w:val="clear"/>
           </w:tcPr>
           <w:p>
             <w:pPr>
               <w:spacing w:before="0" w:after="0" w:line="240" w:lineRule="auto"/>
+              <w:jc w:val="center"/>
             </w:pPr>
             <w:r/>
             <w:r>
               <w:rPr>
-                <w:sz w:val="19"/>
-              </w:rPr>
-              <w:t>88</w:t>
-            </w:r>
-            <w:r>
-              <w:rPr>
+                <w:color w:val="111111"/>
                 <w:sz w:val="19"/>
               </w:rPr>
               <w:t>88</w:t>
@@ -629,26 +580,22 @@
             <w:tcW w:type="dxa" w:w="1872"/>
             <w:vAlign w:val="center"/>
             <w:tcMar>
-              <w:top w:w="120" w:type="dxa"/>
-              <w:bottom w:w="120" w:type="dxa"/>
-              <w:left w:w="140" w:type="dxa"/>
-              <w:right w:w="140" w:type="dxa"/>
+              <w:top w:w="70" w:type="dxa"/>
+              <w:bottom w:w="70" w:type="dxa"/>
+              <w:left w:w="100" w:type="dxa"/>
+              <w:right w:w="100" w:type="dxa"/>
             </w:tcMar>
-            <w:shd w:fill="F7F9FB" w:val="clear"/>
+            <w:shd w:fill="FAFAFA" w:val="clear"/>
           </w:tcPr>
           <w:p>
             <w:pPr>
               <w:spacing w:before="0" w:after="0" w:line="240" w:lineRule="auto"/>
+              <w:jc w:val="center"/>
             </w:pPr>
             <w:r/>
             <w:r>
               <w:rPr>
-                <w:sz w:val="19"/>
-              </w:rPr>
-              <w:t>244</w:t>
-            </w:r>
-            <w:r>
-              <w:rPr>
+                <w:color w:val="111111"/>
                 <w:sz w:val="19"/>
               </w:rPr>
               <w:t>244</w:t>
@@ -660,26 +607,22 @@
             <w:tcW w:type="dxa" w:w="1872"/>
             <w:vAlign w:val="center"/>
             <w:tcMar>
-              <w:top w:w="120" w:type="dxa"/>
-              <w:bottom w:w="120" w:type="dxa"/>
-              <w:left w:w="140" w:type="dxa"/>
-              <w:right w:w="140" w:type="dxa"/>
+              <w:top w:w="70" w:type="dxa"/>
+              <w:bottom w:w="70" w:type="dxa"/>
+              <w:left w:w="100" w:type="dxa"/>
+              <w:right w:w="100" w:type="dxa"/>
             </w:tcMar>
-            <w:shd w:fill="F7F9FB" w:val="clear"/>
+            <w:shd w:fill="FAFAFA" w:val="clear"/>
           </w:tcPr>
           <w:p>
             <w:pPr>
               <w:spacing w:before="0" w:after="0" w:line="240" w:lineRule="auto"/>
+              <w:jc w:val="center"/>
             </w:pPr>
             <w:r/>
             <w:r>
               <w:rPr>
-                <w:sz w:val="19"/>
-              </w:rPr>
-              <w:t>168</w:t>
-            </w:r>
-            <w:r>
-              <w:rPr>
+                <w:color w:val="111111"/>
                 <w:sz w:val="19"/>
               </w:rPr>
               <w:t>168</w:t>
@@ -691,26 +634,22 @@
             <w:tcW w:type="dxa" w:w="1872"/>
             <w:vAlign w:val="center"/>
             <w:tcMar>
-              <w:top w:w="120" w:type="dxa"/>
-              <w:bottom w:w="120" w:type="dxa"/>
-              <w:left w:w="140" w:type="dxa"/>
-              <w:right w:w="140" w:type="dxa"/>
+              <w:top w:w="70" w:type="dxa"/>
+              <w:bottom w:w="70" w:type="dxa"/>
+              <w:left w:w="100" w:type="dxa"/>
+              <w:right w:w="100" w:type="dxa"/>
             </w:tcMar>
-            <w:shd w:fill="F7F9FB" w:val="clear"/>
+            <w:shd w:fill="FAFAFA" w:val="clear"/>
           </w:tcPr>
           <w:p>
             <w:pPr>
               <w:spacing w:before="0" w:after="0" w:line="240" w:lineRule="auto"/>
+              <w:jc w:val="center"/>
             </w:pPr>
             <w:r/>
             <w:r>
               <w:rPr>
-                <w:sz w:val="19"/>
-              </w:rPr>
-              <w:t>500</w:t>
-            </w:r>
-            <w:r>
-              <w:rPr>
+                <w:color w:val="111111"/>
                 <w:sz w:val="19"/>
               </w:rPr>
               <w:t>500</w:t>
@@ -754,9 +693,6 @@
     </w:p>
     <w:p>
       <w:pPr>
-        <w:pStyle w:val="Heading3"/>
-        <w:keepNext/>
-        <w:spacing w:before="240" w:after="80"/>
         <w:jc w:val="center"/>
       </w:pPr>
       <w:r>
@@ -764,8 +700,6 @@
           <w:b w:val="0"/>
           <w:i w:val="0"/>
           <w:strike w:val="0"/>
-          <w:color w:val="1F4E79"/>
-          <w:sz w:val="32"/>
           <w:u w:val="none"/>
         </w:rPr>
         <w:t>FRANKLIN TOWNSHIP</w:t>
@@ -781,8 +715,8 @@
       <w:r>
         <w:drawing>
           <wp:inline xmlns:a="http://schemas.openxmlformats.org/drawingml/2006/main" xmlns:pic="http://schemas.openxmlformats.org/drawingml/2006/picture">
-            <wp:extent cx="5486400" cy="1554480"/>
-            <wp:docPr id="1" name="Picture 1" descr="2011 AP Statistics Exam Header Graphic" title="Exam Header"/>
+            <wp:extent cx="5943600" cy="1977068"/>
+            <wp:docPr id="1" name="Picture 1" descr="Document figure" title="Document figure"/>
             <wp:cNvGraphicFramePr>
               <a:graphicFrameLocks noChangeAspect="1"/>
             </wp:cNvGraphicFramePr>
@@ -802,7 +736,7 @@
                   <pic:spPr>
                     <a:xfrm>
                       <a:off x="0" y="0"/>
-                      <a:ext cx="5486400" cy="1554480"/>
+                      <a:ext cx="5943600" cy="1977068"/>
                     </a:xfrm>
                     <a:prstGeom prst="rect"/>
                   </pic:spPr>
@@ -811,20 +745,6 @@
             </a:graphic>
           </wp:inline>
         </w:drawing>
-      </w:r>
-    </w:p>
-    <w:p>
-      <w:pPr>
-        <w:spacing w:before="40" w:after="120"/>
-        <w:jc w:val="center"/>
-      </w:pPr>
-      <w:r>
-        <w:rPr>
-          <w:i/>
-          <w:color w:val="666666"/>
-          <w:sz w:val="18"/>
-        </w:rPr>
-        <w:t>FRANKLIN TOWNSHIP</w:t>
       </w:r>
     </w:p>
     <w:p>
@@ -840,9 +760,6 @@
     </w:p>
     <w:p>
       <w:pPr>
-        <w:pStyle w:val="Heading3"/>
-        <w:keepNext/>
-        <w:spacing w:before="240" w:after="80"/>
         <w:jc w:val="center"/>
       </w:pPr>
       <w:r>
@@ -850,8 +767,6 @@
           <w:b w:val="0"/>
           <w:i w:val="0"/>
           <w:strike w:val="0"/>
-          <w:color w:val="1F4E79"/>
-          <w:sz w:val="32"/>
           <w:u w:val="none"/>
         </w:rPr>
         <w:t>LAWRENCE TOWNSHIP</w:t>
@@ -867,8 +782,8 @@
       <w:r>
         <w:drawing>
           <wp:inline xmlns:a="http://schemas.openxmlformats.org/drawingml/2006/main" xmlns:pic="http://schemas.openxmlformats.org/drawingml/2006/picture">
-            <wp:extent cx="5486400" cy="1554480"/>
-            <wp:docPr id="2" name="Picture 2" descr="Franklin Township Party Distribution Graphic" title="Party Distribution"/>
+            <wp:extent cx="5943600" cy="2064651"/>
+            <wp:docPr id="2" name="Picture 2" descr="Document figure" title="Document figure"/>
             <wp:cNvGraphicFramePr>
               <a:graphicFrameLocks noChangeAspect="1"/>
             </wp:cNvGraphicFramePr>
@@ -888,7 +803,7 @@
                   <pic:spPr>
                     <a:xfrm>
                       <a:off x="0" y="0"/>
-                      <a:ext cx="5486400" cy="1554480"/>
+                      <a:ext cx="5943600" cy="2064651"/>
                     </a:xfrm>
                     <a:prstGeom prst="rect"/>
                   </pic:spPr>
@@ -897,20 +812,6 @@
             </a:graphic>
           </wp:inline>
         </w:drawing>
-      </w:r>
-    </w:p>
-    <w:p>
-      <w:pPr>
-        <w:spacing w:before="40" w:after="120"/>
-        <w:jc w:val="center"/>
-      </w:pPr>
-      <w:r>
-        <w:rPr>
-          <w:i/>
-          <w:color w:val="666666"/>
-          <w:sz w:val="18"/>
-        </w:rPr>
-        <w:t>LAWRENCE TOWNSHIP</w:t>
       </w:r>
     </w:p>
     <w:p>
@@ -929,9 +830,6 @@
     </w:p>
     <w:p>
       <w:pPr>
-        <w:pStyle w:val="Heading3"/>
-        <w:keepNext/>
-        <w:spacing w:before="240" w:after="80"/>
         <w:jc w:val="right"/>
       </w:pPr>
       <w:r>
@@ -939,8 +837,6 @@
           <w:b/>
           <w:i w:val="0"/>
           <w:strike w:val="0"/>
-          <w:color w:val="1F4E79"/>
-          <w:sz w:val="32"/>
           <w:u w:val="none"/>
         </w:rPr>
         <w:t>GO ON TO THE NEXT PAGE.</w:t>
@@ -968,7 +864,7 @@
     <w:p>
       <w:r>
         <w:rPr>
-          <w:rFonts w:ascii="Times-Roman" w:hAnsi="Times-Roman"/>
+          <w:rFonts w:ascii="TimesNewRoman" w:hAnsi="TimesNewRoman"/>
           <w:b w:val="0"/>
           <w:i w:val="0"/>
           <w:strike w:val="0"/>
@@ -984,52 +880,29 @@
       </w:pPr>
       <w:r>
         <w:rPr>
-          <w:rFonts w:ascii="Times-Bold" w:hAnsi="Times-Bold"/>
-          <w:b w:val="0"/>
-          <w:i w:val="0"/>
-          <w:strike w:val="0"/>
-          <w:sz w:val="20"/>
-          <w:u w:val="none"/>
-        </w:rPr>
-        <w:t xml:space="preserve">Begin your response to </w:t>
-      </w:r>
-      <w:r>
-        <w:rPr>
-          <w:rFonts w:ascii="Times-Bold" w:hAnsi="Times-Bold"/>
+          <w:rFonts w:ascii="TimesNewRoman" w:hAnsi="TimesNewRoman"/>
           <w:b/>
           <w:i w:val="0"/>
           <w:strike w:val="0"/>
-          <w:sz w:val="20"/>
+          <w:sz w:val="22"/>
           <w:u w:val="none"/>
         </w:rPr>
-        <w:t>QUESTION 1</w:t>
-      </w:r>
-      <w:r>
-        <w:rPr>
-          <w:rFonts w:ascii="Times-Roman" w:hAnsi="Times-Roman"/>
-          <w:b w:val="0"/>
-          <w:i w:val="0"/>
-          <w:strike w:val="0"/>
-          <w:sz w:val="20"/>
-          <w:u w:val="none"/>
-        </w:rPr>
-        <w:t xml:space="preserve"> on this page.</w:t>
+        <w:t>Begin your response to QUESTION 1 on this page.</w:t>
       </w:r>
     </w:p>
     <w:p>
       <w:pPr>
-        <w:pStyle w:val="Heading1"/>
         <w:keepNext/>
         <w:spacing w:before="320" w:after="80"/>
         <w:jc w:val="center"/>
       </w:pPr>
       <w:r>
         <w:rPr>
-          <w:rFonts w:ascii="Times-Bold" w:hAnsi="Times-Bold"/>
+          <w:rFonts w:ascii="TimesNewRoman" w:hAnsi="TimesNewRoman"/>
           <w:b/>
           <w:i w:val="0"/>
           <w:strike w:val="0"/>
-          <w:color w:val="1F4E79"/>
+          <w:color w:val="111111"/>
           <w:sz w:val="24"/>
           <w:u w:val="none"/>
         </w:rPr>
@@ -1038,18 +911,17 @@
     </w:p>
     <w:p>
       <w:pPr>
-        <w:pStyle w:val="Heading2"/>
         <w:keepNext/>
         <w:spacing w:before="280" w:after="80"/>
         <w:jc w:val="center"/>
       </w:pPr>
       <w:r>
         <w:rPr>
-          <w:rFonts w:ascii="Times-Bold" w:hAnsi="Times-Bold"/>
+          <w:rFonts w:ascii="TimesNewRoman" w:hAnsi="TimesNewRoman"/>
           <w:b/>
           <w:i w:val="0"/>
           <w:strike w:val="0"/>
-          <w:color w:val="1F4E79"/>
+          <w:color w:val="111111"/>
           <w:sz w:val="22"/>
           <w:u w:val="none"/>
         </w:rPr>
@@ -1062,11 +934,11 @@
       </w:pPr>
       <w:r>
         <w:rPr>
-          <w:rFonts w:ascii="Times-Bold" w:hAnsi="Times-Bold"/>
+          <w:rFonts w:ascii="TimesNewRoman" w:hAnsi="TimesNewRoman"/>
           <w:b/>
           <w:i w:val="0"/>
           <w:strike w:val="0"/>
-          <w:sz w:val="20"/>
+          <w:sz w:val="22"/>
           <w:u w:val="none"/>
         </w:rPr>
         <w:t>Total Time—1 hour and 30 minutes</w:t>
@@ -1074,19 +946,15 @@
     </w:p>
     <w:p>
       <w:pPr>
-        <w:pStyle w:val="Heading3"/>
-        <w:keepNext/>
-        <w:spacing w:before="240" w:after="80"/>
         <w:jc w:val="center"/>
       </w:pPr>
       <w:r>
         <w:rPr>
-          <w:rFonts w:ascii="Times-Bold" w:hAnsi="Times-Bold"/>
+          <w:rFonts w:ascii="TimesNewRoman" w:hAnsi="TimesNewRoman"/>
           <w:b/>
           <w:i w:val="0"/>
           <w:strike w:val="0"/>
-          <w:color w:val="1F4E79"/>
-          <w:sz w:val="20"/>
+          <w:sz w:val="22"/>
           <w:u w:val="none"/>
         </w:rPr>
         <w:t>6 Questions</w:t>
@@ -1094,18 +962,17 @@
     </w:p>
     <w:p>
       <w:pPr>
-        <w:pStyle w:val="Heading3"/>
         <w:keepNext/>
         <w:spacing w:before="240" w:after="80"/>
         <w:jc w:val="center"/>
       </w:pPr>
       <w:r>
         <w:rPr>
-          <w:rFonts w:ascii="Times-Bold" w:hAnsi="Times-Bold"/>
+          <w:rFonts w:ascii="TimesNewRoman" w:hAnsi="TimesNewRoman"/>
           <w:b/>
           <w:i w:val="0"/>
           <w:strike w:val="0"/>
-          <w:color w:val="1F4E79"/>
+          <w:color w:val="111111"/>
           <w:sz w:val="22"/>
           <w:u w:val="none"/>
         </w:rPr>
@@ -1118,11 +985,11 @@
       </w:pPr>
       <w:r>
         <w:rPr>
-          <w:rFonts w:ascii="Times-Bold" w:hAnsi="Times-Bold"/>
+          <w:rFonts w:ascii="TimesNewRoman" w:hAnsi="TimesNewRoman"/>
           <w:b/>
           <w:i w:val="0"/>
           <w:strike w:val="0"/>
-          <w:sz w:val="20"/>
+          <w:sz w:val="22"/>
           <w:u w:val="none"/>
         </w:rPr>
         <w:t>Questions 1-5</w:t>
@@ -1134,11 +1001,11 @@
       </w:pPr>
       <w:r>
         <w:rPr>
-          <w:rFonts w:ascii="Times-Bold" w:hAnsi="Times-Bold"/>
+          <w:rFonts w:ascii="TimesNewRoman" w:hAnsi="TimesNewRoman"/>
           <w:b/>
           <w:i w:val="0"/>
           <w:strike w:val="0"/>
-          <w:sz w:val="20"/>
+          <w:sz w:val="22"/>
           <w:u w:val="none"/>
         </w:rPr>
         <w:t>Spend about 1 hour and 5 minutes on this part of the exam.</w:t>
@@ -1147,49 +1014,38 @@
     <w:p>
       <w:r>
         <w:rPr>
-          <w:rFonts w:ascii="Times-Bold" w:hAnsi="Times-Bold"/>
+          <w:rFonts w:ascii="TimesNewRoman" w:hAnsi="TimesNewRoman"/>
           <w:b/>
           <w:i w:val="0"/>
           <w:strike w:val="0"/>
           <w:sz w:val="20"/>
           <w:u w:val="none"/>
         </w:rPr>
-        <w:t xml:space="preserve">Directions: </w:t>
+        <w:t>Directions:</w:t>
       </w:r>
       <w:r>
         <w:rPr>
-          <w:rFonts w:ascii="Times-Roman" w:hAnsi="Times-Roman"/>
+          <w:rFonts w:ascii="TimesNewRoman" w:hAnsi="TimesNewRoman"/>
           <w:b w:val="0"/>
           <w:i w:val="0"/>
           <w:strike w:val="0"/>
           <w:sz w:val="20"/>
           <w:u w:val="none"/>
         </w:rPr>
-        <w:t>Show all your work. Indicate clearly the methods you use, because you will be scored on the correctness of your methods as well as on the accuracy and completeness of your results and explanations.</w:t>
+        <w:t xml:space="preserve"> Show all your work. Indicate clearly the methods you use, because you will be scored on the correctness of your methods as well as on the accuracy and completeness of your results and explanations.</w:t>
       </w:r>
     </w:p>
     <w:p>
       <w:r>
         <w:rPr>
-          <w:rFonts w:ascii="Times-Roman" w:hAnsi="Times-Roman"/>
+          <w:rFonts w:ascii="TimesNewRoman" w:hAnsi="TimesNewRoman"/>
           <w:b w:val="0"/>
           <w:i w:val="0"/>
           <w:strike w:val="0"/>
           <w:sz w:val="20"/>
           <w:u w:val="none"/>
         </w:rPr>
-        <w:t xml:space="preserve">1. </w:t>
-      </w:r>
-      <w:r>
-        <w:rPr>
-          <w:rFonts w:ascii="Times-Roman" w:hAnsi="Times-Roman"/>
-          <w:b w:val="0"/>
-          <w:i w:val="0"/>
-          <w:strike w:val="0"/>
-          <w:sz w:val="20"/>
-          <w:u w:val="none"/>
-        </w:rPr>
-        <w:t>The length of stay in a hospital after receiving a particular treatment is of interest to the patient, the hospital, and insurance providers. Of particular interest are unusually short or long lengths of stay. A random sample of 50 patients who received the treatment was selected, and the length of stay, in number of days, was recorded for each patient. The results are summarized in the following table and are shown in the dotplot.</w:t>
+        <w:t>1. The length of stay in a hospital after receiving a particular treatment is of interest to the patient, the hospital, and insurance providers. Of particular interest are unusually short or long lengths of stay. A random sample of 50 patients who received the treatment was selected, and the length of stay, in number of days, was recorded for each patient. The results are summarized in the following table and are shown in the dotplot.</w:t>
       </w:r>
     </w:p>
     <w:tbl>
@@ -1197,6 +1053,14 @@
         <w:tblW w:type="auto" w:w="0"/>
         <w:jc w:val="center"/>
         <w:tblLook w:firstColumn="1" w:firstRow="1" w:lastColumn="0" w:lastRow="0" w:noHBand="0" w:noVBand="1" w:val="04A0"/>
+        <w:tblBorders>
+          <w:top w:val="single" w:sz="4" w:space="0" w:color="444444"/>
+          <w:left w:val="single" w:sz="4" w:space="0" w:color="444444"/>
+          <w:bottom w:val="single" w:sz="4" w:space="0" w:color="444444"/>
+          <w:right w:val="single" w:sz="4" w:space="0" w:color="444444"/>
+          <w:insideH w:val="single" w:sz="4" w:space="0" w:color="444444"/>
+          <w:insideV w:val="single" w:sz="4" w:space="0" w:color="444444"/>
+        </w:tblBorders>
       </w:tblPr>
       <w:tblGrid>
         <w:gridCol w:w="1080"/>
@@ -1218,31 +1082,24 @@
             <w:tcW w:type="dxa" w:w="3276"/>
             <w:vAlign w:val="center"/>
             <w:tcMar>
-              <w:top w:w="120" w:type="dxa"/>
-              <w:bottom w:w="120" w:type="dxa"/>
-              <w:left w:w="140" w:type="dxa"/>
-              <w:right w:w="140" w:type="dxa"/>
+              <w:top w:w="70" w:type="dxa"/>
+              <w:bottom w:w="70" w:type="dxa"/>
+              <w:left w:w="100" w:type="dxa"/>
+              <w:right w:w="100" w:type="dxa"/>
             </w:tcMar>
-            <w:shd w:fill="1F4E79" w:val="clear"/>
+            <w:shd w:fill="F2F4F7" w:val="clear"/>
           </w:tcPr>
           <w:p>
             <w:pPr>
               <w:spacing w:before="0" w:after="0" w:line="240" w:lineRule="auto"/>
+              <w:jc w:val="center"/>
             </w:pPr>
             <w:r/>
             <w:r>
               <w:rPr>
                 <w:b/>
-                <w:color w:val="FFFFFF"/>
-                <w:sz w:val="20"/>
-              </w:rPr>
-              <w:t>Length of stay (days)</w:t>
-            </w:r>
-            <w:r>
-              <w:rPr>
-                <w:b/>
-                <w:color w:val="FFFFFF"/>
-                <w:sz w:val="20"/>
+                <w:color w:val="000000"/>
+                <w:sz w:val="19"/>
               </w:rPr>
               <w:t>Length of stay (days)</w:t>
             </w:r>
@@ -1253,31 +1110,24 @@
             <w:tcW w:type="dxa" w:w="842"/>
             <w:vAlign w:val="center"/>
             <w:tcMar>
-              <w:top w:w="120" w:type="dxa"/>
-              <w:bottom w:w="120" w:type="dxa"/>
-              <w:left w:w="140" w:type="dxa"/>
-              <w:right w:w="140" w:type="dxa"/>
+              <w:top w:w="70" w:type="dxa"/>
+              <w:bottom w:w="70" w:type="dxa"/>
+              <w:left w:w="100" w:type="dxa"/>
+              <w:right w:w="100" w:type="dxa"/>
             </w:tcMar>
-            <w:shd w:fill="1F4E79" w:val="clear"/>
+            <w:shd w:fill="F2F4F7" w:val="clear"/>
           </w:tcPr>
           <w:p>
             <w:pPr>
               <w:spacing w:before="0" w:after="0" w:line="240" w:lineRule="auto"/>
+              <w:jc w:val="center"/>
             </w:pPr>
             <w:r/>
             <w:r>
               <w:rPr>
                 <w:b/>
-                <w:color w:val="FFFFFF"/>
-                <w:sz w:val="20"/>
-              </w:rPr>
-              <w:t>5</w:t>
-            </w:r>
-            <w:r>
-              <w:rPr>
-                <w:b/>
-                <w:color w:val="FFFFFF"/>
-                <w:sz w:val="20"/>
+                <w:color w:val="000000"/>
+                <w:sz w:val="19"/>
               </w:rPr>
               <w:t>5</w:t>
             </w:r>
@@ -1288,31 +1138,24 @@
             <w:tcW w:type="dxa" w:w="842"/>
             <w:vAlign w:val="center"/>
             <w:tcMar>
-              <w:top w:w="120" w:type="dxa"/>
-              <w:bottom w:w="120" w:type="dxa"/>
-              <w:left w:w="140" w:type="dxa"/>
-              <w:right w:w="140" w:type="dxa"/>
+              <w:top w:w="70" w:type="dxa"/>
+              <w:bottom w:w="70" w:type="dxa"/>
+              <w:left w:w="100" w:type="dxa"/>
+              <w:right w:w="100" w:type="dxa"/>
             </w:tcMar>
-            <w:shd w:fill="1F4E79" w:val="clear"/>
+            <w:shd w:fill="F2F4F7" w:val="clear"/>
           </w:tcPr>
           <w:p>
             <w:pPr>
               <w:spacing w:before="0" w:after="0" w:line="240" w:lineRule="auto"/>
+              <w:jc w:val="center"/>
             </w:pPr>
             <w:r/>
             <w:r>
               <w:rPr>
                 <w:b/>
-                <w:color w:val="FFFFFF"/>
-                <w:sz w:val="20"/>
-              </w:rPr>
-              <w:t>6</w:t>
-            </w:r>
-            <w:r>
-              <w:rPr>
-                <w:b/>
-                <w:color w:val="FFFFFF"/>
-                <w:sz w:val="20"/>
+                <w:color w:val="000000"/>
+                <w:sz w:val="19"/>
               </w:rPr>
               <w:t>6</w:t>
             </w:r>
@@ -1323,31 +1166,24 @@
             <w:tcW w:type="dxa" w:w="842"/>
             <w:vAlign w:val="center"/>
             <w:tcMar>
-              <w:top w:w="120" w:type="dxa"/>
-              <w:bottom w:w="120" w:type="dxa"/>
-              <w:left w:w="140" w:type="dxa"/>
-              <w:right w:w="140" w:type="dxa"/>
+              <w:top w:w="70" w:type="dxa"/>
+              <w:bottom w:w="70" w:type="dxa"/>
+              <w:left w:w="100" w:type="dxa"/>
+              <w:right w:w="100" w:type="dxa"/>
             </w:tcMar>
-            <w:shd w:fill="1F4E79" w:val="clear"/>
+            <w:shd w:fill="F2F4F7" w:val="clear"/>
           </w:tcPr>
           <w:p>
             <w:pPr>
               <w:spacing w:before="0" w:after="0" w:line="240" w:lineRule="auto"/>
+              <w:jc w:val="center"/>
             </w:pPr>
             <w:r/>
             <w:r>
               <w:rPr>
                 <w:b/>
-                <w:color w:val="FFFFFF"/>
-                <w:sz w:val="20"/>
-              </w:rPr>
-              <w:t>7</w:t>
-            </w:r>
-            <w:r>
-              <w:rPr>
-                <w:b/>
-                <w:color w:val="FFFFFF"/>
-                <w:sz w:val="20"/>
+                <w:color w:val="000000"/>
+                <w:sz w:val="19"/>
               </w:rPr>
               <w:t>7</w:t>
             </w:r>
@@ -1358,31 +1194,24 @@
             <w:tcW w:type="dxa" w:w="842"/>
             <w:vAlign w:val="center"/>
             <w:tcMar>
-              <w:top w:w="120" w:type="dxa"/>
-              <w:bottom w:w="120" w:type="dxa"/>
-              <w:left w:w="140" w:type="dxa"/>
-              <w:right w:w="140" w:type="dxa"/>
+              <w:top w:w="70" w:type="dxa"/>
+              <w:bottom w:w="70" w:type="dxa"/>
+              <w:left w:w="100" w:type="dxa"/>
+              <w:right w:w="100" w:type="dxa"/>
             </w:tcMar>
-            <w:shd w:fill="1F4E79" w:val="clear"/>
+            <w:shd w:fill="F2F4F7" w:val="clear"/>
           </w:tcPr>
           <w:p>
             <w:pPr>
               <w:spacing w:before="0" w:after="0" w:line="240" w:lineRule="auto"/>
+              <w:jc w:val="center"/>
             </w:pPr>
             <w:r/>
             <w:r>
               <w:rPr>
                 <w:b/>
-                <w:color w:val="FFFFFF"/>
-                <w:sz w:val="20"/>
-              </w:rPr>
-              <w:t>8</w:t>
-            </w:r>
-            <w:r>
-              <w:rPr>
-                <w:b/>
-                <w:color w:val="FFFFFF"/>
-                <w:sz w:val="20"/>
+                <w:color w:val="000000"/>
+                <w:sz w:val="19"/>
               </w:rPr>
               <w:t>8</w:t>
             </w:r>
@@ -1393,31 +1222,24 @@
             <w:tcW w:type="dxa" w:w="842"/>
             <w:vAlign w:val="center"/>
             <w:tcMar>
-              <w:top w:w="120" w:type="dxa"/>
-              <w:bottom w:w="120" w:type="dxa"/>
-              <w:left w:w="140" w:type="dxa"/>
-              <w:right w:w="140" w:type="dxa"/>
+              <w:top w:w="70" w:type="dxa"/>
+              <w:bottom w:w="70" w:type="dxa"/>
+              <w:left w:w="100" w:type="dxa"/>
+              <w:right w:w="100" w:type="dxa"/>
             </w:tcMar>
-            <w:shd w:fill="1F4E79" w:val="clear"/>
+            <w:shd w:fill="F2F4F7" w:val="clear"/>
           </w:tcPr>
           <w:p>
             <w:pPr>
               <w:spacing w:before="0" w:after="0" w:line="240" w:lineRule="auto"/>
+              <w:jc w:val="center"/>
             </w:pPr>
             <w:r/>
             <w:r>
               <w:rPr>
                 <w:b/>
-                <w:color w:val="FFFFFF"/>
-                <w:sz w:val="20"/>
-              </w:rPr>
-              <w:t>9</w:t>
-            </w:r>
-            <w:r>
-              <w:rPr>
-                <w:b/>
-                <w:color w:val="FFFFFF"/>
-                <w:sz w:val="20"/>
+                <w:color w:val="000000"/>
+                <w:sz w:val="19"/>
               </w:rPr>
               <w:t>9</w:t>
             </w:r>
@@ -1428,31 +1250,24 @@
             <w:tcW w:type="dxa" w:w="936"/>
             <w:vAlign w:val="center"/>
             <w:tcMar>
-              <w:top w:w="120" w:type="dxa"/>
-              <w:bottom w:w="120" w:type="dxa"/>
-              <w:left w:w="140" w:type="dxa"/>
-              <w:right w:w="140" w:type="dxa"/>
+              <w:top w:w="70" w:type="dxa"/>
+              <w:bottom w:w="70" w:type="dxa"/>
+              <w:left w:w="100" w:type="dxa"/>
+              <w:right w:w="100" w:type="dxa"/>
             </w:tcMar>
-            <w:shd w:fill="1F4E79" w:val="clear"/>
+            <w:shd w:fill="F2F4F7" w:val="clear"/>
           </w:tcPr>
           <w:p>
             <w:pPr>
               <w:spacing w:before="0" w:after="0" w:line="240" w:lineRule="auto"/>
+              <w:jc w:val="center"/>
             </w:pPr>
             <w:r/>
             <w:r>
               <w:rPr>
                 <w:b/>
-                <w:color w:val="FFFFFF"/>
-                <w:sz w:val="20"/>
-              </w:rPr>
-              <w:t>12</w:t>
-            </w:r>
-            <w:r>
-              <w:rPr>
-                <w:b/>
-                <w:color w:val="FFFFFF"/>
-                <w:sz w:val="20"/>
+                <w:color w:val="000000"/>
+                <w:sz w:val="19"/>
               </w:rPr>
               <w:t>12</w:t>
             </w:r>
@@ -1463,31 +1278,24 @@
             <w:tcW w:type="dxa" w:w="936"/>
             <w:vAlign w:val="center"/>
             <w:tcMar>
-              <w:top w:w="120" w:type="dxa"/>
-              <w:bottom w:w="120" w:type="dxa"/>
-              <w:left w:w="140" w:type="dxa"/>
-              <w:right w:w="140" w:type="dxa"/>
+              <w:top w:w="70" w:type="dxa"/>
+              <w:bottom w:w="70" w:type="dxa"/>
+              <w:left w:w="100" w:type="dxa"/>
+              <w:right w:w="100" w:type="dxa"/>
             </w:tcMar>
-            <w:shd w:fill="1F4E79" w:val="clear"/>
+            <w:shd w:fill="F2F4F7" w:val="clear"/>
           </w:tcPr>
           <w:p>
             <w:pPr>
               <w:spacing w:before="0" w:after="0" w:line="240" w:lineRule="auto"/>
+              <w:jc w:val="center"/>
             </w:pPr>
             <w:r/>
             <w:r>
               <w:rPr>
                 <w:b/>
-                <w:color w:val="FFFFFF"/>
-                <w:sz w:val="20"/>
-              </w:rPr>
-              <w:t>21</w:t>
-            </w:r>
-            <w:r>
-              <w:rPr>
-                <w:b/>
-                <w:color w:val="FFFFFF"/>
-                <w:sz w:val="20"/>
+                <w:color w:val="000000"/>
+                <w:sz w:val="19"/>
               </w:rPr>
               <w:t>21</w:t>
             </w:r>
@@ -1503,26 +1311,22 @@
             <w:tcW w:type="dxa" w:w="3276"/>
             <w:vAlign w:val="center"/>
             <w:tcMar>
-              <w:top w:w="120" w:type="dxa"/>
-              <w:bottom w:w="120" w:type="dxa"/>
-              <w:left w:w="140" w:type="dxa"/>
-              <w:right w:w="140" w:type="dxa"/>
+              <w:top w:w="70" w:type="dxa"/>
+              <w:bottom w:w="70" w:type="dxa"/>
+              <w:left w:w="100" w:type="dxa"/>
+              <w:right w:w="100" w:type="dxa"/>
             </w:tcMar>
-            <w:shd w:fill="F7F9FB" w:val="clear"/>
+            <w:shd w:fill="FAFAFA" w:val="clear"/>
           </w:tcPr>
           <w:p>
             <w:pPr>
               <w:spacing w:before="0" w:after="0" w:line="240" w:lineRule="auto"/>
+              <w:jc w:val="left"/>
             </w:pPr>
             <w:r/>
             <w:r>
               <w:rPr>
-                <w:sz w:val="19"/>
-              </w:rPr>
-              <w:t>Number of patients</w:t>
-            </w:r>
-            <w:r>
-              <w:rPr>
+                <w:color w:val="111111"/>
                 <w:sz w:val="19"/>
               </w:rPr>
               <w:t>Number of patients</w:t>
@@ -1534,26 +1338,22 @@
             <w:tcW w:type="dxa" w:w="842"/>
             <w:vAlign w:val="center"/>
             <w:tcMar>
-              <w:top w:w="120" w:type="dxa"/>
-              <w:bottom w:w="120" w:type="dxa"/>
-              <w:left w:w="140" w:type="dxa"/>
-              <w:right w:w="140" w:type="dxa"/>
+              <w:top w:w="70" w:type="dxa"/>
+              <w:bottom w:w="70" w:type="dxa"/>
+              <w:left w:w="100" w:type="dxa"/>
+              <w:right w:w="100" w:type="dxa"/>
             </w:tcMar>
-            <w:shd w:fill="F7F9FB" w:val="clear"/>
+            <w:shd w:fill="FAFAFA" w:val="clear"/>
           </w:tcPr>
           <w:p>
             <w:pPr>
               <w:spacing w:before="0" w:after="0" w:line="240" w:lineRule="auto"/>
+              <w:jc w:val="center"/>
             </w:pPr>
             <w:r/>
             <w:r>
               <w:rPr>
-                <w:sz w:val="19"/>
-              </w:rPr>
-              <w:t>4</w:t>
-            </w:r>
-            <w:r>
-              <w:rPr>
+                <w:color w:val="111111"/>
                 <w:sz w:val="19"/>
               </w:rPr>
               <w:t>4</w:t>
@@ -1565,26 +1365,22 @@
             <w:tcW w:type="dxa" w:w="842"/>
             <w:vAlign w:val="center"/>
             <w:tcMar>
-              <w:top w:w="120" w:type="dxa"/>
-              <w:bottom w:w="120" w:type="dxa"/>
-              <w:left w:w="140" w:type="dxa"/>
-              <w:right w:w="140" w:type="dxa"/>
+              <w:top w:w="70" w:type="dxa"/>
+              <w:bottom w:w="70" w:type="dxa"/>
+              <w:left w:w="100" w:type="dxa"/>
+              <w:right w:w="100" w:type="dxa"/>
             </w:tcMar>
-            <w:shd w:fill="F7F9FB" w:val="clear"/>
+            <w:shd w:fill="FAFAFA" w:val="clear"/>
           </w:tcPr>
           <w:p>
             <w:pPr>
               <w:spacing w:before="0" w:after="0" w:line="240" w:lineRule="auto"/>
+              <w:jc w:val="center"/>
             </w:pPr>
             <w:r/>
             <w:r>
               <w:rPr>
-                <w:sz w:val="19"/>
-              </w:rPr>
-              <w:t>13</w:t>
-            </w:r>
-            <w:r>
-              <w:rPr>
+                <w:color w:val="111111"/>
                 <w:sz w:val="19"/>
               </w:rPr>
               <w:t>13</w:t>
@@ -1596,26 +1392,22 @@
             <w:tcW w:type="dxa" w:w="842"/>
             <w:vAlign w:val="center"/>
             <w:tcMar>
-              <w:top w:w="120" w:type="dxa"/>
-              <w:bottom w:w="120" w:type="dxa"/>
-              <w:left w:w="140" w:type="dxa"/>
-              <w:right w:w="140" w:type="dxa"/>
+              <w:top w:w="70" w:type="dxa"/>
+              <w:bottom w:w="70" w:type="dxa"/>
+              <w:left w:w="100" w:type="dxa"/>
+              <w:right w:w="100" w:type="dxa"/>
             </w:tcMar>
-            <w:shd w:fill="F7F9FB" w:val="clear"/>
+            <w:shd w:fill="FAFAFA" w:val="clear"/>
           </w:tcPr>
           <w:p>
             <w:pPr>
               <w:spacing w:before="0" w:after="0" w:line="240" w:lineRule="auto"/>
+              <w:jc w:val="center"/>
             </w:pPr>
             <w:r/>
             <w:r>
               <w:rPr>
-                <w:sz w:val="19"/>
-              </w:rPr>
-              <w:t>14</w:t>
-            </w:r>
-            <w:r>
-              <w:rPr>
+                <w:color w:val="111111"/>
                 <w:sz w:val="19"/>
               </w:rPr>
               <w:t>14</w:t>
@@ -1627,26 +1419,22 @@
             <w:tcW w:type="dxa" w:w="842"/>
             <w:vAlign w:val="center"/>
             <w:tcMar>
-              <w:top w:w="120" w:type="dxa"/>
-              <w:bottom w:w="120" w:type="dxa"/>
-              <w:left w:w="140" w:type="dxa"/>
-              <w:right w:w="140" w:type="dxa"/>
+              <w:top w:w="70" w:type="dxa"/>
+              <w:bottom w:w="70" w:type="dxa"/>
+              <w:left w:w="100" w:type="dxa"/>
+              <w:right w:w="100" w:type="dxa"/>
             </w:tcMar>
-            <w:shd w:fill="F7F9FB" w:val="clear"/>
+            <w:shd w:fill="FAFAFA" w:val="clear"/>
           </w:tcPr>
           <w:p>
             <w:pPr>
               <w:spacing w:before="0" w:after="0" w:line="240" w:lineRule="auto"/>
+              <w:jc w:val="center"/>
             </w:pPr>
             <w:r/>
             <w:r>
               <w:rPr>
-                <w:sz w:val="19"/>
-              </w:rPr>
-              <w:t>11</w:t>
-            </w:r>
-            <w:r>
-              <w:rPr>
+                <w:color w:val="111111"/>
                 <w:sz w:val="19"/>
               </w:rPr>
               <w:t>11</w:t>
@@ -1658,26 +1446,22 @@
             <w:tcW w:type="dxa" w:w="842"/>
             <w:vAlign w:val="center"/>
             <w:tcMar>
-              <w:top w:w="120" w:type="dxa"/>
-              <w:bottom w:w="120" w:type="dxa"/>
-              <w:left w:w="140" w:type="dxa"/>
-              <w:right w:w="140" w:type="dxa"/>
+              <w:top w:w="70" w:type="dxa"/>
+              <w:bottom w:w="70" w:type="dxa"/>
+              <w:left w:w="100" w:type="dxa"/>
+              <w:right w:w="100" w:type="dxa"/>
             </w:tcMar>
-            <w:shd w:fill="F7F9FB" w:val="clear"/>
+            <w:shd w:fill="FAFAFA" w:val="clear"/>
           </w:tcPr>
           <w:p>
             <w:pPr>
               <w:spacing w:before="0" w:after="0" w:line="240" w:lineRule="auto"/>
+              <w:jc w:val="center"/>
             </w:pPr>
             <w:r/>
             <w:r>
               <w:rPr>
-                <w:sz w:val="19"/>
-              </w:rPr>
-              <w:t>6</w:t>
-            </w:r>
-            <w:r>
-              <w:rPr>
+                <w:color w:val="111111"/>
                 <w:sz w:val="19"/>
               </w:rPr>
               <w:t>6</w:t>
@@ -1689,26 +1473,22 @@
             <w:tcW w:type="dxa" w:w="936"/>
             <w:vAlign w:val="center"/>
             <w:tcMar>
-              <w:top w:w="120" w:type="dxa"/>
-              <w:bottom w:w="120" w:type="dxa"/>
-              <w:left w:w="140" w:type="dxa"/>
-              <w:right w:w="140" w:type="dxa"/>
+              <w:top w:w="70" w:type="dxa"/>
+              <w:bottom w:w="70" w:type="dxa"/>
+              <w:left w:w="100" w:type="dxa"/>
+              <w:right w:w="100" w:type="dxa"/>
             </w:tcMar>
-            <w:shd w:fill="F7F9FB" w:val="clear"/>
+            <w:shd w:fill="FAFAFA" w:val="clear"/>
           </w:tcPr>
           <w:p>
             <w:pPr>
               <w:spacing w:before="0" w:after="0" w:line="240" w:lineRule="auto"/>
+              <w:jc w:val="center"/>
             </w:pPr>
             <w:r/>
             <w:r>
               <w:rPr>
-                <w:sz w:val="19"/>
-              </w:rPr>
-              <w:t>1</w:t>
-            </w:r>
-            <w:r>
-              <w:rPr>
+                <w:color w:val="111111"/>
                 <w:sz w:val="19"/>
               </w:rPr>
               <w:t>1</w:t>
@@ -1720,26 +1500,22 @@
             <w:tcW w:type="dxa" w:w="936"/>
             <w:vAlign w:val="center"/>
             <w:tcMar>
-              <w:top w:w="120" w:type="dxa"/>
-              <w:bottom w:w="120" w:type="dxa"/>
-              <w:left w:w="140" w:type="dxa"/>
-              <w:right w:w="140" w:type="dxa"/>
+              <w:top w:w="70" w:type="dxa"/>
+              <w:bottom w:w="70" w:type="dxa"/>
+              <w:left w:w="100" w:type="dxa"/>
+              <w:right w:w="100" w:type="dxa"/>
             </w:tcMar>
-            <w:shd w:fill="F7F9FB" w:val="clear"/>
+            <w:shd w:fill="FAFAFA" w:val="clear"/>
           </w:tcPr>
           <w:p>
             <w:pPr>
               <w:spacing w:before="0" w:after="0" w:line="240" w:lineRule="auto"/>
+              <w:jc w:val="center"/>
             </w:pPr>
             <w:r/>
             <w:r>
               <w:rPr>
-                <w:sz w:val="19"/>
-              </w:rPr>
-              <w:t>1</w:t>
-            </w:r>
-            <w:r>
-              <w:rPr>
+                <w:color w:val="111111"/>
                 <w:sz w:val="19"/>
               </w:rPr>
               <w:t>1</w:t>
@@ -1758,8 +1534,8 @@
       <w:r>
         <w:drawing>
           <wp:inline xmlns:a="http://schemas.openxmlformats.org/drawingml/2006/main" xmlns:pic="http://schemas.openxmlformats.org/drawingml/2006/picture">
-            <wp:extent cx="3200400" cy="1371600"/>
-            <wp:docPr id="3" name="Picture 3" descr="Length of stay dotplot distribution" title="Dotplot"/>
+            <wp:extent cx="3108960" cy="1596493"/>
+            <wp:docPr id="3" name="Picture 3" descr="Length of Stay (days)" title="Length of Stay (days)"/>
             <wp:cNvGraphicFramePr>
               <a:graphicFrameLocks noChangeAspect="1"/>
             </wp:cNvGraphicFramePr>
@@ -1779,7 +1555,7 @@
                   <pic:spPr>
                     <a:xfrm>
                       <a:off x="0" y="0"/>
-                      <a:ext cx="3200400" cy="1371600"/>
+                      <a:ext cx="3108960" cy="1596493"/>
                     </a:xfrm>
                     <a:prstGeom prst="rect"/>
                   </pic:spPr>
@@ -1791,9 +1567,23 @@
       </w:r>
     </w:p>
     <w:p>
+      <w:pPr>
+        <w:spacing w:before="40" w:after="120"/>
+        <w:jc w:val="center"/>
+      </w:pPr>
       <w:r>
         <w:rPr>
-          <w:rFonts w:ascii="Times-Roman" w:hAnsi="Times-Roman"/>
+          <w:i/>
+          <w:color w:val="666666"/>
+          <w:sz w:val="18"/>
+        </w:rPr>
+        <w:t>Length of Stay (days)</w:t>
+      </w:r>
+    </w:p>
+    <w:p>
+      <w:r>
+        <w:rPr>
+          <w:rFonts w:ascii="TimesNewRoman" w:hAnsi="TimesNewRoman"/>
           <w:b w:val="0"/>
           <w:i w:val="0"/>
           <w:strike w:val="0"/>
@@ -1809,11 +1599,11 @@
       </w:pPr>
       <w:r>
         <w:rPr>
-          <w:rFonts w:ascii="Times-Bold" w:hAnsi="Times-Bold"/>
+          <w:rFonts w:ascii="TimesNewRoman" w:hAnsi="TimesNewRoman"/>
           <w:b/>
           <w:i w:val="0"/>
           <w:strike w:val="0"/>
-          <w:sz w:val="20"/>
+          <w:sz w:val="22"/>
           <w:u w:val="none"/>
         </w:rPr>
         <w:t>GO ON TO THE NEXT PAGE.</w:t>
@@ -1825,7 +1615,7 @@
       </w:pPr>
       <w:r>
         <w:rPr>
-          <w:rFonts w:ascii="Times-Roman" w:hAnsi="Times-Roman"/>
+          <w:rFonts w:ascii="TimesNewRoman" w:hAnsi="TimesNewRoman"/>
           <w:b w:val="0"/>
           <w:i w:val="0"/>
           <w:strike w:val="0"/>
@@ -1841,7 +1631,7 @@
       </w:pPr>
       <w:r>
         <w:rPr>
-          <w:rFonts w:ascii="Times-Roman" w:hAnsi="Times-Roman"/>
+          <w:rFonts w:ascii="TimesNewRoman" w:hAnsi="TimesNewRoman"/>
           <w:b w:val="0"/>
           <w:i w:val="0"/>
           <w:strike w:val="0"/>
@@ -1859,11 +1649,11 @@
       </w:pPr>
       <w:r>
         <w:rPr>
-          <w:rFonts w:ascii="Times-Roman" w:hAnsi="Times-Roman"/>
-          <w:b w:val="0"/>
+          <w:rFonts w:ascii="TimesNewRoman" w:hAnsi="TimesNewRoman"/>
+          <w:b/>
           <w:i w:val="0"/>
           <w:strike w:val="0"/>
-          <w:sz w:val="20"/>
+          <w:sz w:val="18"/>
           <w:u w:val="none"/>
         </w:rPr>
         <w:t>4</w:t>
@@ -1882,7 +1672,25 @@
           <w:strike w:val="0"/>
           <w:u w:val="none"/>
         </w:rPr>
-        <w:t>AP® Statistics 2021 Free-Response Questions</w:t>
+        <w:t>AP</w:t>
+      </w:r>
+      <w:r>
+        <w:rPr>
+          <w:b w:val="0"/>
+          <w:i w:val="0"/>
+          <w:strike w:val="0"/>
+          <w:u w:val="none"/>
+        </w:rPr>
+        <w:t>®</w:t>
+      </w:r>
+      <w:r>
+        <w:rPr>
+          <w:b w:val="0"/>
+          <w:i w:val="0"/>
+          <w:strike w:val="0"/>
+          <w:u w:val="none"/>
+        </w:rPr>
+        <w:t xml:space="preserve"> Statistics 2021 Free-Response Questions</w:t>
       </w:r>
     </w:p>
     <w:p>
@@ -1916,7 +1724,25 @@
           <w:strike w:val="0"/>
           <w:u w:val="none"/>
         </w:rPr>
-        <w:t>1.5 × IQR</w:t>
+        <w:t>1.5</w:t>
+      </w:r>
+      <w:r>
+        <w:rPr>
+          <w:b w:val="0"/>
+          <w:i w:val="0"/>
+          <w:strike w:val="0"/>
+          <w:u w:val="none"/>
+        </w:rPr>
+        <w:t xml:space="preserve"> × </w:t>
+      </w:r>
+      <w:r>
+        <w:rPr>
+          <w:b w:val="0"/>
+          <w:i w:val="0"/>
+          <w:strike w:val="0"/>
+          <w:u w:val="none"/>
+        </w:rPr>
+        <w:t>IQR</w:t>
       </w:r>
       <w:r>
         <w:rPr>
@@ -1936,7 +1762,7 @@
           <w:strike w:val="0"/>
           <w:u w:val="none"/>
         </w:rPr>
-        <w:t xml:space="preserve">(i) Using method A, determine any data points that are potential outliers in the distribution of length of </w:t>
+        <w:t>(i) Using method A, determine any data points that are potential outliers in the distribution of length of</w:t>
       </w:r>
       <w:r>
         <w:rPr>
@@ -1945,6 +1771,7 @@
           <w:strike w:val="0"/>
           <w:u w:val="none"/>
         </w:rPr>
+        <w:br/>
         <w:t>stay. Justify your answer.</w:t>
       </w:r>
     </w:p>
@@ -1956,24 +1783,10 @@
           <w:strike w:val="0"/>
           <w:u w:val="none"/>
         </w:rPr>
-        <w:t xml:space="preserve">(ii) The mean length of stay for the sample is 7.42 days with a standard deviation of 2.37 days. Using </w:t>
-      </w:r>
-      <w:r>
-        <w:rPr>
-          <w:b w:val="0"/>
-          <w:i w:val="0"/>
-          <w:strike w:val="0"/>
-          <w:u w:val="none"/>
-        </w:rPr>
-        <w:t xml:space="preserve">method B, determine any data points that are potential outliers in the distribution of length of stay. Justify </w:t>
-      </w:r>
-      <w:r>
-        <w:rPr>
-          <w:b w:val="0"/>
-          <w:i w:val="0"/>
-          <w:strike w:val="0"/>
-          <w:u w:val="none"/>
-        </w:rPr>
+        <w:t>(ii) The mean length of stay for the sample is 7.42 days with a standard deviation of 2.37 days. Using</w:t>
+        <w:br/>
+        <w:t>method B, determine any data points that are potential outliers in the distribution of length of stay. Justify</w:t>
+        <w:br/>
         <w:t>your answer.</w:t>
       </w:r>
     </w:p>
@@ -1985,15 +1798,8 @@
           <w:strike w:val="0"/>
           <w:u w:val="none"/>
         </w:rPr>
-        <w:t xml:space="preserve">(c) Explain why method A might identify more data points as potential outliers than method B for a </w:t>
-      </w:r>
-      <w:r>
-        <w:rPr>
-          <w:b w:val="0"/>
-          <w:i w:val="0"/>
-          <w:strike w:val="0"/>
-          <w:u w:val="none"/>
-        </w:rPr>
+        <w:t>(c) Explain why method A might identify more data points as potential outliers than method B for a</w:t>
+        <w:br/>
         <w:t>distribution that is strongly skewed to the right.</w:t>
       </w:r>
     </w:p>
@@ -2003,7 +1809,7 @@
       </w:pPr>
       <w:r>
         <w:rPr>
-          <w:b/>
+          <w:b w:val="0"/>
           <w:i w:val="0"/>
           <w:strike w:val="0"/>
           <w:u w:val="none"/>
@@ -2037,19 +1843,7 @@
           <w:u w:val="none"/>
         </w:rPr>
         <w:t>© 2021 College Board.</w:t>
-      </w:r>
-    </w:p>
-    <w:p>
-      <w:pPr>
-        <w:jc w:val="center"/>
-      </w:pPr>
-      <w:r>
-        <w:rPr>
-          <w:b w:val="0"/>
-          <w:i w:val="0"/>
-          <w:strike w:val="0"/>
-          <w:u w:val="none"/>
-        </w:rPr>
+        <w:br/>
         <w:t>Visit College Board on the web: collegeboard.org.</w:t>
       </w:r>
     </w:p>
@@ -2074,381 +1868,6 @@
     </w:p>
     <w:p>
       <w:r>
-        <w:rPr>
-          <w:rFonts w:ascii="Times-Roman" w:hAnsi="Times-Roman"/>
-          <w:b w:val="0"/>
-          <w:i w:val="0"/>
-          <w:strike w:val="0"/>
-          <w:sz w:val="20"/>
-          <w:u w:val="none"/>
-        </w:rPr>
-        <w:t>AP® Statistics 2023 Free-Response Questions</w:t>
-      </w:r>
-    </w:p>
-    <w:p>
-      <w:pPr>
-        <w:jc w:val="center"/>
-      </w:pPr>
-      <w:r>
-        <w:rPr>
-          <w:rFonts w:ascii="Times-Bold" w:hAnsi="Times-Bold"/>
-          <w:b w:val="0"/>
-          <w:i w:val="0"/>
-          <w:strike w:val="0"/>
-          <w:sz w:val="20"/>
-          <w:u w:val="none"/>
-        </w:rPr>
-        <w:t xml:space="preserve">Begin your response to </w:t>
-      </w:r>
-      <w:r>
-        <w:rPr>
-          <w:rFonts w:ascii="Times-Bold" w:hAnsi="Times-Bold"/>
-          <w:b/>
-          <w:i w:val="0"/>
-          <w:strike w:val="0"/>
-          <w:sz w:val="20"/>
-          <w:u w:val="none"/>
-        </w:rPr>
-        <w:t>QUESTION 1</w:t>
-      </w:r>
-      <w:r>
-        <w:rPr>
-          <w:rFonts w:ascii="Times-Roman" w:hAnsi="Times-Roman"/>
-          <w:b w:val="0"/>
-          <w:i w:val="0"/>
-          <w:strike w:val="0"/>
-          <w:sz w:val="20"/>
-          <w:u w:val="none"/>
-        </w:rPr>
-        <w:t xml:space="preserve"> on this page.</w:t>
-      </w:r>
-    </w:p>
-    <w:p>
-      <w:pPr>
-        <w:pStyle w:val="Heading1"/>
-        <w:keepNext/>
-        <w:spacing w:before="320" w:after="80"/>
-        <w:jc w:val="center"/>
-      </w:pPr>
-      <w:r>
-        <w:rPr>
-          <w:rFonts w:ascii="Times-Bold" w:hAnsi="Times-Bold"/>
-          <w:b/>
-          <w:i w:val="0"/>
-          <w:strike w:val="0"/>
-          <w:color w:val="1F4E79"/>
-          <w:sz w:val="22"/>
-          <w:u w:val="none"/>
-        </w:rPr>
-        <w:t>STATISTICS</w:t>
-      </w:r>
-    </w:p>
-    <w:p>
-      <w:pPr>
-        <w:pStyle w:val="Heading2"/>
-        <w:keepNext/>
-        <w:spacing w:before="280" w:after="80"/>
-        <w:jc w:val="center"/>
-      </w:pPr>
-      <w:r>
-        <w:rPr>
-          <w:rFonts w:ascii="Times-Bold" w:hAnsi="Times-Bold"/>
-          <w:b/>
-          <w:i w:val="0"/>
-          <w:strike w:val="0"/>
-          <w:color w:val="1F4E79"/>
-          <w:sz w:val="22"/>
-          <w:u w:val="none"/>
-        </w:rPr>
-        <w:t>SECTION II</w:t>
-      </w:r>
-    </w:p>
-    <w:p>
-      <w:pPr>
-        <w:jc w:val="center"/>
-      </w:pPr>
-      <w:r>
-        <w:rPr>
-          <w:rFonts w:ascii="Times-Bold" w:hAnsi="Times-Bold"/>
-          <w:b/>
-          <w:i w:val="0"/>
-          <w:strike w:val="0"/>
-          <w:sz w:val="20"/>
-          <w:u w:val="none"/>
-        </w:rPr>
-        <w:t>Total Time—1 hour and 30 minutes</w:t>
-      </w:r>
-    </w:p>
-    <w:p>
-      <w:pPr>
-        <w:jc w:val="center"/>
-      </w:pPr>
-      <w:r>
-        <w:rPr>
-          <w:rFonts w:ascii="Times-Bold" w:hAnsi="Times-Bold"/>
-          <w:b/>
-          <w:i w:val="0"/>
-          <w:strike w:val="0"/>
-          <w:sz w:val="20"/>
-          <w:u w:val="none"/>
-        </w:rPr>
-        <w:t>6 Questions</w:t>
-      </w:r>
-    </w:p>
-    <w:p>
-      <w:pPr>
-        <w:pStyle w:val="Heading3"/>
-        <w:keepNext/>
-        <w:spacing w:before="240" w:after="80"/>
-        <w:jc w:val="center"/>
-      </w:pPr>
-      <w:r>
-        <w:rPr>
-          <w:rFonts w:ascii="Times-Bold" w:hAnsi="Times-Bold"/>
-          <w:b/>
-          <w:i w:val="0"/>
-          <w:strike w:val="0"/>
-          <w:color w:val="1F4E79"/>
-          <w:sz w:val="22"/>
-          <w:u w:val="none"/>
-        </w:rPr>
-        <w:t>Part A</w:t>
-      </w:r>
-    </w:p>
-    <w:p>
-      <w:pPr>
-        <w:jc w:val="center"/>
-      </w:pPr>
-      <w:r>
-        <w:rPr>
-          <w:rFonts w:ascii="Times-Bold" w:hAnsi="Times-Bold"/>
-          <w:b/>
-          <w:i w:val="0"/>
-          <w:strike w:val="0"/>
-          <w:sz w:val="20"/>
-          <w:u w:val="none"/>
-        </w:rPr>
-        <w:t>Suggested Time—1 hour and 5 minutes</w:t>
-      </w:r>
-    </w:p>
-    <w:p>
-      <w:pPr>
-        <w:jc w:val="center"/>
-      </w:pPr>
-      <w:r>
-        <w:rPr>
-          <w:rFonts w:ascii="Times-Bold" w:hAnsi="Times-Bold"/>
-          <w:b/>
-          <w:i w:val="0"/>
-          <w:strike w:val="0"/>
-          <w:sz w:val="20"/>
-          <w:u w:val="none"/>
-        </w:rPr>
-        <w:t>5 Questions</w:t>
-      </w:r>
-    </w:p>
-    <w:p>
-      <w:r>
-        <w:rPr>
-          <w:rFonts w:ascii="Times-Bold" w:hAnsi="Times-Bold"/>
-          <w:b/>
-          <w:i w:val="0"/>
-          <w:strike w:val="0"/>
-          <w:sz w:val="20"/>
-          <w:u w:val="none"/>
-        </w:rPr>
-        <w:t>Directions:</w:t>
-      </w:r>
-      <w:r>
-        <w:rPr>
-          <w:rFonts w:ascii="Times-Roman" w:hAnsi="Times-Roman"/>
-          <w:b w:val="0"/>
-          <w:i w:val="0"/>
-          <w:strike w:val="0"/>
-          <w:sz w:val="20"/>
-          <w:u w:val="none"/>
-        </w:rPr>
-        <w:t xml:space="preserve"> Show all your work. Indicate clearly the methods you use, because you will be scored on the correctness of your methods as well as on the accuracy and completeness of your results and explanations.</w:t>
-      </w:r>
-    </w:p>
-    <w:p>
-      <w:r>
-        <w:rPr>
-          <w:rFonts w:ascii="Times-Roman" w:hAnsi="Times-Roman"/>
-          <w:b w:val="0"/>
-          <w:i w:val="0"/>
-          <w:strike w:val="0"/>
-          <w:sz w:val="20"/>
-          <w:u w:val="none"/>
-        </w:rPr>
-        <w:t>1. As part of a study on the chemistry of Alaskan streams, researchers took water samples from many streams with temperatures colder than 8°C and from many streams with temperatures warmer than 8°C. For each sample, the researchers measured the dissolved oxygen concentration, in milligrams per liter (mg/l).</w:t>
-      </w:r>
-    </w:p>
-    <w:p>
-      <w:pPr>
-        <w:spacing w:before="160" w:after="160"/>
-        <w:jc w:val="center"/>
-      </w:pPr>
-    </w:p>
-    <w:p>
-      <w:r>
-        <w:drawing>
-          <wp:inline xmlns:a="http://schemas.openxmlformats.org/drawingml/2006/main" xmlns:pic="http://schemas.openxmlformats.org/drawingml/2006/picture">
-            <wp:extent cx="4114800" cy="642166"/>
-            <wp:docPr id="4" name="Picture 4" descr="Dissolved oxygen concentration histogram" title="Histogram"/>
-            <wp:cNvGraphicFramePr>
-              <a:graphicFrameLocks noChangeAspect="1"/>
-            </wp:cNvGraphicFramePr>
-            <a:graphic>
-              <a:graphicData uri="http://schemas.openxmlformats.org/drawingml/2006/picture">
-                <pic:pic>
-                  <pic:nvPicPr>
-                    <pic:cNvPr id="0" name="chart_1981175872912.png"/>
-                    <pic:cNvPicPr/>
-                  </pic:nvPicPr>
-                  <pic:blipFill>
-                    <a:blip r:embed="rId12"/>
-                    <a:stretch>
-                      <a:fillRect/>
-                    </a:stretch>
-                  </pic:blipFill>
-                  <pic:spPr>
-                    <a:xfrm>
-                      <a:off x="0" y="0"/>
-                      <a:ext cx="4114800" cy="642166"/>
-                    </a:xfrm>
-                    <a:prstGeom prst="rect"/>
-                  </pic:spPr>
-                </pic:pic>
-              </a:graphicData>
-            </a:graphic>
-          </wp:inline>
-        </w:drawing>
-      </w:r>
-    </w:p>
-    <w:p>
-      <w:r>
-        <w:rPr>
-          <w:rFonts w:ascii="Times-Roman" w:hAnsi="Times-Roman"/>
-          <w:b w:val="0"/>
-          <w:i w:val="0"/>
-          <w:strike w:val="0"/>
-          <w:sz w:val="20"/>
-          <w:u w:val="none"/>
-        </w:rPr>
-        <w:t xml:space="preserve">(a) The researchers constructed the histogram shown for the dissolved oxygen concentration in streams from the sample with water temperatures </w:t>
-      </w:r>
-      <w:r>
-        <w:rPr>
-          <w:rFonts w:ascii="Times-Roman" w:hAnsi="Times-Roman"/>
-          <w:b w:val="0"/>
-          <w:i w:val="0"/>
-          <w:strike w:val="0"/>
-          <w:sz w:val="20"/>
-          <w:u w:val="none"/>
-        </w:rPr>
-        <w:t>colder</w:t>
-      </w:r>
-      <w:r>
-        <w:rPr>
-          <w:rFonts w:ascii="Times-Roman" w:hAnsi="Times-Roman"/>
-          <w:b w:val="0"/>
-          <w:i w:val="0"/>
-          <w:strike w:val="0"/>
-          <w:sz w:val="20"/>
-          <w:u w:val="none"/>
-        </w:rPr>
-        <w:t xml:space="preserve"> than 8°C. Based on the histogram, describe the distribution of dissolved oxygen concentration in streams with water temperatures </w:t>
-      </w:r>
-      <w:r>
-        <w:rPr>
-          <w:rFonts w:ascii="Times-Roman" w:hAnsi="Times-Roman"/>
-          <w:b w:val="0"/>
-          <w:i w:val="0"/>
-          <w:strike w:val="0"/>
-          <w:sz w:val="20"/>
-          <w:u w:val="none"/>
-        </w:rPr>
-        <w:t>colder</w:t>
-      </w:r>
-      <w:r>
-        <w:rPr>
-          <w:rFonts w:ascii="Times-Roman" w:hAnsi="Times-Roman"/>
-          <w:b w:val="0"/>
-          <w:i w:val="0"/>
-          <w:strike w:val="0"/>
-          <w:sz w:val="20"/>
-          <w:u w:val="none"/>
-        </w:rPr>
-        <w:t xml:space="preserve"> than 8°C.</w:t>
-      </w:r>
-    </w:p>
-    <w:p>
-      <w:pPr>
-        <w:jc w:val="right"/>
-      </w:pPr>
-      <w:r>
-        <w:rPr>
-          <w:rFonts w:ascii="Times-Bold" w:hAnsi="Times-Bold"/>
-          <w:b/>
-          <w:i w:val="0"/>
-          <w:strike w:val="0"/>
-          <w:sz w:val="20"/>
-          <w:u w:val="none"/>
-        </w:rPr>
-        <w:t>GO ON TO THE NEXT PAGE.</w:t>
-      </w:r>
-    </w:p>
-    <w:p>
-      <w:pPr>
-        <w:jc w:val="center"/>
-      </w:pPr>
-      <w:r>
-        <w:rPr>
-          <w:rFonts w:ascii="Times-Roman" w:hAnsi="Times-Roman"/>
-          <w:b w:val="0"/>
-          <w:i w:val="0"/>
-          <w:strike w:val="0"/>
-          <w:sz w:val="18"/>
-          <w:u w:val="none"/>
-        </w:rPr>
-        <w:t>© 2023 College Board.</w:t>
-      </w:r>
-    </w:p>
-    <w:p>
-      <w:pPr>
-        <w:jc w:val="center"/>
-      </w:pPr>
-      <w:r>
-        <w:rPr>
-          <w:rFonts w:ascii="Times-Roman" w:hAnsi="Times-Roman"/>
-          <w:b w:val="0"/>
-          <w:i w:val="0"/>
-          <w:strike w:val="0"/>
-          <w:sz w:val="18"/>
-          <w:u w:val="none"/>
-        </w:rPr>
-        <w:t>Visit College Board on the web: collegeboard.org.</w:t>
-      </w:r>
-    </w:p>
-    <w:p>
-      <w:pPr>
-        <w:jc w:val="center"/>
-      </w:pPr>
-      <w:r>
-        <w:rPr>
-          <w:rFonts w:ascii="Times-Roman" w:hAnsi="Times-Roman"/>
-          <w:b w:val="0"/>
-          <w:i w:val="0"/>
-          <w:strike w:val="0"/>
-          <w:sz w:val="18"/>
-          <w:u w:val="none"/>
-        </w:rPr>
-        <w:t>4</w:t>
-      </w:r>
-    </w:p>
-    <w:p>
-      <w:r>
         <w:br w:type="page"/>
       </w:r>
     </w:p>
@@ -2460,7 +1879,7 @@
           <w:strike w:val="0"/>
           <w:u w:val="none"/>
         </w:rPr>
-        <w:t>AP Statistics 2023 Free-Response Questions</w:t>
+        <w:t>AP® Statistics 2023 Free-Response Questions</w:t>
       </w:r>
     </w:p>
     <w:p>
@@ -2482,6 +1901,14 @@
         <w:tblW w:type="auto" w:w="0"/>
         <w:jc w:val="center"/>
         <w:tblLook w:firstColumn="1" w:firstRow="1" w:lastColumn="0" w:lastRow="0" w:noHBand="0" w:noVBand="1" w:val="04A0"/>
+        <w:tblBorders>
+          <w:top w:val="single" w:sz="4" w:space="0" w:color="444444"/>
+          <w:left w:val="single" w:sz="4" w:space="0" w:color="444444"/>
+          <w:bottom w:val="single" w:sz="4" w:space="0" w:color="444444"/>
+          <w:right w:val="single" w:sz="4" w:space="0" w:color="444444"/>
+          <w:insideH w:val="single" w:sz="4" w:space="0" w:color="444444"/>
+          <w:insideV w:val="single" w:sz="4" w:space="0" w:color="444444"/>
+        </w:tblBorders>
       </w:tblPr>
       <w:tblGrid>
         <w:gridCol w:w="1234"/>
@@ -2499,34 +1926,27 @@
         </w:trPr>
         <w:tc>
           <w:tcPr>
-            <w:tcW w:type="dxa" w:w="1337"/>
+            <w:tcW w:type="dxa" w:w="1310"/>
             <w:vAlign w:val="center"/>
             <w:tcMar>
-              <w:top w:w="120" w:type="dxa"/>
-              <w:bottom w:w="120" w:type="dxa"/>
-              <w:left w:w="140" w:type="dxa"/>
-              <w:right w:w="140" w:type="dxa"/>
+              <w:top w:w="70" w:type="dxa"/>
+              <w:bottom w:w="70" w:type="dxa"/>
+              <w:left w:w="100" w:type="dxa"/>
+              <w:right w:w="100" w:type="dxa"/>
             </w:tcMar>
-            <w:shd w:fill="1F4E79" w:val="clear"/>
+            <w:shd w:fill="F2F4F7" w:val="clear"/>
           </w:tcPr>
           <w:p>
             <w:pPr>
               <w:spacing w:before="0" w:after="0" w:line="240" w:lineRule="auto"/>
+              <w:jc w:val="center"/>
             </w:pPr>
             <w:r/>
             <w:r>
               <w:rPr>
                 <w:b/>
-                <w:color w:val="FFFFFF"/>
-                <w:sz w:val="20"/>
-              </w:rPr>
-              <w:t>Min</w:t>
-            </w:r>
-            <w:r>
-              <w:rPr>
-                <w:b/>
-                <w:color w:val="FFFFFF"/>
-                <w:sz w:val="20"/>
+                <w:color w:val="000000"/>
+                <w:sz w:val="19"/>
               </w:rPr>
               <w:t>Min</w:t>
             </w:r>
@@ -2534,34 +1954,27 @@
         </w:tc>
         <w:tc>
           <w:tcPr>
-            <w:tcW w:type="dxa" w:w="1337"/>
+            <w:tcW w:type="dxa" w:w="1310"/>
             <w:vAlign w:val="center"/>
             <w:tcMar>
-              <w:top w:w="120" w:type="dxa"/>
-              <w:bottom w:w="120" w:type="dxa"/>
-              <w:left w:w="140" w:type="dxa"/>
-              <w:right w:w="140" w:type="dxa"/>
+              <w:top w:w="70" w:type="dxa"/>
+              <w:bottom w:w="70" w:type="dxa"/>
+              <w:left w:w="100" w:type="dxa"/>
+              <w:right w:w="100" w:type="dxa"/>
             </w:tcMar>
-            <w:shd w:fill="1F4E79" w:val="clear"/>
+            <w:shd w:fill="F2F4F7" w:val="clear"/>
           </w:tcPr>
           <w:p>
             <w:pPr>
               <w:spacing w:before="0" w:after="0" w:line="240" w:lineRule="auto"/>
+              <w:jc w:val="center"/>
             </w:pPr>
             <w:r/>
             <w:r>
               <w:rPr>
                 <w:b/>
-                <w:color w:val="FFFFFF"/>
-                <w:sz w:val="20"/>
-              </w:rPr>
-              <w:t>Q1</w:t>
-            </w:r>
-            <w:r>
-              <w:rPr>
-                <w:b/>
-                <w:color w:val="FFFFFF"/>
-                <w:sz w:val="20"/>
+                <w:color w:val="000000"/>
+                <w:sz w:val="19"/>
               </w:rPr>
               <w:t>Q1</w:t>
             </w:r>
@@ -2569,34 +1982,27 @@
         </w:tc>
         <w:tc>
           <w:tcPr>
-            <w:tcW w:type="dxa" w:w="1337"/>
+            <w:tcW w:type="dxa" w:w="1310"/>
             <w:vAlign w:val="center"/>
             <w:tcMar>
-              <w:top w:w="120" w:type="dxa"/>
-              <w:bottom w:w="120" w:type="dxa"/>
-              <w:left w:w="140" w:type="dxa"/>
-              <w:right w:w="140" w:type="dxa"/>
+              <w:top w:w="70" w:type="dxa"/>
+              <w:bottom w:w="70" w:type="dxa"/>
+              <w:left w:w="100" w:type="dxa"/>
+              <w:right w:w="100" w:type="dxa"/>
             </w:tcMar>
-            <w:shd w:fill="1F4E79" w:val="clear"/>
+            <w:shd w:fill="F2F4F7" w:val="clear"/>
           </w:tcPr>
           <w:p>
             <w:pPr>
               <w:spacing w:before="0" w:after="0" w:line="240" w:lineRule="auto"/>
+              <w:jc w:val="center"/>
             </w:pPr>
             <w:r/>
             <w:r>
               <w:rPr>
                 <w:b/>
-                <w:color w:val="FFFFFF"/>
-                <w:sz w:val="20"/>
-              </w:rPr>
-              <w:t>Median</w:t>
-            </w:r>
-            <w:r>
-              <w:rPr>
-                <w:b/>
-                <w:color w:val="FFFFFF"/>
-                <w:sz w:val="20"/>
+                <w:color w:val="000000"/>
+                <w:sz w:val="19"/>
               </w:rPr>
               <w:t>Median</w:t>
             </w:r>
@@ -2604,34 +2010,27 @@
         </w:tc>
         <w:tc>
           <w:tcPr>
-            <w:tcW w:type="dxa" w:w="1337"/>
+            <w:tcW w:type="dxa" w:w="1310"/>
             <w:vAlign w:val="center"/>
             <w:tcMar>
-              <w:top w:w="120" w:type="dxa"/>
-              <w:bottom w:w="120" w:type="dxa"/>
-              <w:left w:w="140" w:type="dxa"/>
-              <w:right w:w="140" w:type="dxa"/>
+              <w:top w:w="70" w:type="dxa"/>
+              <w:bottom w:w="70" w:type="dxa"/>
+              <w:left w:w="100" w:type="dxa"/>
+              <w:right w:w="100" w:type="dxa"/>
             </w:tcMar>
-            <w:shd w:fill="1F4E79" w:val="clear"/>
+            <w:shd w:fill="F2F4F7" w:val="clear"/>
           </w:tcPr>
           <w:p>
             <w:pPr>
               <w:spacing w:before="0" w:after="0" w:line="240" w:lineRule="auto"/>
+              <w:jc w:val="center"/>
             </w:pPr>
             <w:r/>
             <w:r>
               <w:rPr>
                 <w:b/>
-                <w:color w:val="FFFFFF"/>
-                <w:sz w:val="20"/>
-              </w:rPr>
-              <w:t>Q3</w:t>
-            </w:r>
-            <w:r>
-              <w:rPr>
-                <w:b/>
-                <w:color w:val="FFFFFF"/>
-                <w:sz w:val="20"/>
+                <w:color w:val="000000"/>
+                <w:sz w:val="19"/>
               </w:rPr>
               <w:t>Q3</w:t>
             </w:r>
@@ -2639,34 +2038,27 @@
         </w:tc>
         <w:tc>
           <w:tcPr>
-            <w:tcW w:type="dxa" w:w="1337"/>
+            <w:tcW w:type="dxa" w:w="1310"/>
             <w:vAlign w:val="center"/>
             <w:tcMar>
-              <w:top w:w="120" w:type="dxa"/>
-              <w:bottom w:w="120" w:type="dxa"/>
-              <w:left w:w="140" w:type="dxa"/>
-              <w:right w:w="140" w:type="dxa"/>
+              <w:top w:w="70" w:type="dxa"/>
+              <w:bottom w:w="70" w:type="dxa"/>
+              <w:left w:w="100" w:type="dxa"/>
+              <w:right w:w="100" w:type="dxa"/>
             </w:tcMar>
-            <w:shd w:fill="1F4E79" w:val="clear"/>
+            <w:shd w:fill="F2F4F7" w:val="clear"/>
           </w:tcPr>
           <w:p>
             <w:pPr>
               <w:spacing w:before="0" w:after="0" w:line="240" w:lineRule="auto"/>
+              <w:jc w:val="center"/>
             </w:pPr>
             <w:r/>
             <w:r>
               <w:rPr>
                 <w:b/>
-                <w:color w:val="FFFFFF"/>
-                <w:sz w:val="20"/>
-              </w:rPr>
-              <w:t>Max</w:t>
-            </w:r>
-            <w:r>
-              <w:rPr>
-                <w:b/>
-                <w:color w:val="FFFFFF"/>
-                <w:sz w:val="20"/>
+                <w:color w:val="000000"/>
+                <w:sz w:val="19"/>
               </w:rPr>
               <w:t>Max</w:t>
             </w:r>
@@ -2674,34 +2066,27 @@
         </w:tc>
         <w:tc>
           <w:tcPr>
-            <w:tcW w:type="dxa" w:w="1337"/>
+            <w:tcW w:type="dxa" w:w="1404"/>
             <w:vAlign w:val="center"/>
             <w:tcMar>
-              <w:top w:w="120" w:type="dxa"/>
-              <w:bottom w:w="120" w:type="dxa"/>
-              <w:left w:w="140" w:type="dxa"/>
-              <w:right w:w="140" w:type="dxa"/>
+              <w:top w:w="70" w:type="dxa"/>
+              <w:bottom w:w="70" w:type="dxa"/>
+              <w:left w:w="100" w:type="dxa"/>
+              <w:right w:w="100" w:type="dxa"/>
             </w:tcMar>
-            <w:shd w:fill="1F4E79" w:val="clear"/>
+            <w:shd w:fill="F2F4F7" w:val="clear"/>
           </w:tcPr>
           <w:p>
             <w:pPr>
               <w:spacing w:before="0" w:after="0" w:line="240" w:lineRule="auto"/>
+              <w:jc w:val="center"/>
             </w:pPr>
             <w:r/>
             <w:r>
               <w:rPr>
                 <w:b/>
-                <w:color w:val="FFFFFF"/>
-                <w:sz w:val="20"/>
-              </w:rPr>
-              <w:t>Mean</w:t>
-            </w:r>
-            <w:r>
-              <w:rPr>
-                <w:b/>
-                <w:color w:val="FFFFFF"/>
-                <w:sz w:val="20"/>
+                <w:color w:val="000000"/>
+                <w:sz w:val="19"/>
               </w:rPr>
               <w:t>Mean</w:t>
             </w:r>
@@ -2709,34 +2094,27 @@
         </w:tc>
         <w:tc>
           <w:tcPr>
-            <w:tcW w:type="dxa" w:w="1340"/>
+            <w:tcW w:type="dxa" w:w="1404"/>
             <w:vAlign w:val="center"/>
             <w:tcMar>
-              <w:top w:w="120" w:type="dxa"/>
-              <w:bottom w:w="120" w:type="dxa"/>
-              <w:left w:w="140" w:type="dxa"/>
-              <w:right w:w="140" w:type="dxa"/>
+              <w:top w:w="70" w:type="dxa"/>
+              <w:bottom w:w="70" w:type="dxa"/>
+              <w:left w:w="100" w:type="dxa"/>
+              <w:right w:w="100" w:type="dxa"/>
             </w:tcMar>
-            <w:shd w:fill="1F4E79" w:val="clear"/>
+            <w:shd w:fill="F2F4F7" w:val="clear"/>
           </w:tcPr>
           <w:p>
             <w:pPr>
               <w:spacing w:before="0" w:after="0" w:line="240" w:lineRule="auto"/>
+              <w:jc w:val="center"/>
             </w:pPr>
             <w:r/>
             <w:r>
               <w:rPr>
                 <w:b/>
-                <w:color w:val="FFFFFF"/>
-                <w:sz w:val="20"/>
-              </w:rPr>
-              <w:t>Std. Dev.</w:t>
-            </w:r>
-            <w:r>
-              <w:rPr>
-                <w:b/>
-                <w:color w:val="FFFFFF"/>
-                <w:sz w:val="20"/>
+                <w:color w:val="000000"/>
+                <w:sz w:val="19"/>
               </w:rPr>
               <w:t>Std. Dev.</w:t>
             </w:r>
@@ -2749,29 +2127,25 @@
         </w:trPr>
         <w:tc>
           <w:tcPr>
-            <w:tcW w:type="dxa" w:w="1337"/>
+            <w:tcW w:type="dxa" w:w="1310"/>
             <w:vAlign w:val="center"/>
             <w:tcMar>
-              <w:top w:w="120" w:type="dxa"/>
-              <w:bottom w:w="120" w:type="dxa"/>
-              <w:left w:w="140" w:type="dxa"/>
-              <w:right w:w="140" w:type="dxa"/>
+              <w:top w:w="70" w:type="dxa"/>
+              <w:bottom w:w="70" w:type="dxa"/>
+              <w:left w:w="100" w:type="dxa"/>
+              <w:right w:w="100" w:type="dxa"/>
             </w:tcMar>
-            <w:shd w:fill="F7F9FB" w:val="clear"/>
+            <w:shd w:fill="FAFAFA" w:val="clear"/>
           </w:tcPr>
           <w:p>
             <w:pPr>
               <w:spacing w:before="0" w:after="0" w:line="240" w:lineRule="auto"/>
+              <w:jc w:val="left"/>
             </w:pPr>
             <w:r/>
             <w:r>
               <w:rPr>
-                <w:sz w:val="19"/>
-              </w:rPr>
-              <w:t>2.10</w:t>
-            </w:r>
-            <w:r>
-              <w:rPr>
+                <w:color w:val="111111"/>
                 <w:sz w:val="19"/>
               </w:rPr>
               <w:t>2.10</w:t>
@@ -2780,29 +2154,25 @@
         </w:tc>
         <w:tc>
           <w:tcPr>
-            <w:tcW w:type="dxa" w:w="1337"/>
+            <w:tcW w:type="dxa" w:w="1310"/>
             <w:vAlign w:val="center"/>
             <w:tcMar>
-              <w:top w:w="120" w:type="dxa"/>
-              <w:bottom w:w="120" w:type="dxa"/>
-              <w:left w:w="140" w:type="dxa"/>
-              <w:right w:w="140" w:type="dxa"/>
+              <w:top w:w="70" w:type="dxa"/>
+              <w:bottom w:w="70" w:type="dxa"/>
+              <w:left w:w="100" w:type="dxa"/>
+              <w:right w:w="100" w:type="dxa"/>
             </w:tcMar>
-            <w:shd w:fill="F7F9FB" w:val="clear"/>
+            <w:shd w:fill="FAFAFA" w:val="clear"/>
           </w:tcPr>
           <w:p>
             <w:pPr>
               <w:spacing w:before="0" w:after="0" w:line="240" w:lineRule="auto"/>
+              <w:jc w:val="center"/>
             </w:pPr>
             <w:r/>
             <w:r>
               <w:rPr>
-                <w:sz w:val="19"/>
-              </w:rPr>
-              <w:t>4.39</w:t>
-            </w:r>
-            <w:r>
-              <w:rPr>
+                <w:color w:val="111111"/>
                 <w:sz w:val="19"/>
               </w:rPr>
               <w:t>4.39</w:t>
@@ -2811,29 +2181,25 @@
         </w:tc>
         <w:tc>
           <w:tcPr>
-            <w:tcW w:type="dxa" w:w="1337"/>
+            <w:tcW w:type="dxa" w:w="1310"/>
             <w:vAlign w:val="center"/>
             <w:tcMar>
-              <w:top w:w="120" w:type="dxa"/>
-              <w:bottom w:w="120" w:type="dxa"/>
-              <w:left w:w="140" w:type="dxa"/>
-              <w:right w:w="140" w:type="dxa"/>
+              <w:top w:w="70" w:type="dxa"/>
+              <w:bottom w:w="70" w:type="dxa"/>
+              <w:left w:w="100" w:type="dxa"/>
+              <w:right w:w="100" w:type="dxa"/>
             </w:tcMar>
-            <w:shd w:fill="F7F9FB" w:val="clear"/>
+            <w:shd w:fill="FAFAFA" w:val="clear"/>
           </w:tcPr>
           <w:p>
             <w:pPr>
               <w:spacing w:before="0" w:after="0" w:line="240" w:lineRule="auto"/>
+              <w:jc w:val="center"/>
             </w:pPr>
             <w:r/>
             <w:r>
               <w:rPr>
-                <w:sz w:val="19"/>
-              </w:rPr>
-              <w:t>5.43</w:t>
-            </w:r>
-            <w:r>
-              <w:rPr>
+                <w:color w:val="111111"/>
                 <w:sz w:val="19"/>
               </w:rPr>
               <w:t>5.43</w:t>
@@ -2842,29 +2208,25 @@
         </w:tc>
         <w:tc>
           <w:tcPr>
-            <w:tcW w:type="dxa" w:w="1337"/>
+            <w:tcW w:type="dxa" w:w="1310"/>
             <w:vAlign w:val="center"/>
             <w:tcMar>
-              <w:top w:w="120" w:type="dxa"/>
-              <w:bottom w:w="120" w:type="dxa"/>
-              <w:left w:w="140" w:type="dxa"/>
-              <w:right w:w="140" w:type="dxa"/>
+              <w:top w:w="70" w:type="dxa"/>
+              <w:bottom w:w="70" w:type="dxa"/>
+              <w:left w:w="100" w:type="dxa"/>
+              <w:right w:w="100" w:type="dxa"/>
             </w:tcMar>
-            <w:shd w:fill="F7F9FB" w:val="clear"/>
+            <w:shd w:fill="FAFAFA" w:val="clear"/>
           </w:tcPr>
           <w:p>
             <w:pPr>
               <w:spacing w:before="0" w:after="0" w:line="240" w:lineRule="auto"/>
+              <w:jc w:val="center"/>
             </w:pPr>
             <w:r/>
             <w:r>
               <w:rPr>
-                <w:sz w:val="19"/>
-              </w:rPr>
-              <w:t>6.12</w:t>
-            </w:r>
-            <w:r>
-              <w:rPr>
+                <w:color w:val="111111"/>
                 <w:sz w:val="19"/>
               </w:rPr>
               <w:t>6.12</w:t>
@@ -2873,29 +2235,25 @@
         </w:tc>
         <w:tc>
           <w:tcPr>
-            <w:tcW w:type="dxa" w:w="1337"/>
+            <w:tcW w:type="dxa" w:w="1310"/>
             <w:vAlign w:val="center"/>
             <w:tcMar>
-              <w:top w:w="120" w:type="dxa"/>
-              <w:bottom w:w="120" w:type="dxa"/>
-              <w:left w:w="140" w:type="dxa"/>
-              <w:right w:w="140" w:type="dxa"/>
+              <w:top w:w="70" w:type="dxa"/>
+              <w:bottom w:w="70" w:type="dxa"/>
+              <w:left w:w="100" w:type="dxa"/>
+              <w:right w:w="100" w:type="dxa"/>
             </w:tcMar>
-            <w:shd w:fill="F7F9FB" w:val="clear"/>
+            <w:shd w:fill="FAFAFA" w:val="clear"/>
           </w:tcPr>
           <w:p>
             <w:pPr>
               <w:spacing w:before="0" w:after="0" w:line="240" w:lineRule="auto"/>
+              <w:jc w:val="center"/>
             </w:pPr>
             <w:r/>
             <w:r>
               <w:rPr>
-                <w:sz w:val="19"/>
-              </w:rPr>
-              <w:t>13.45</w:t>
-            </w:r>
-            <w:r>
-              <w:rPr>
+                <w:color w:val="111111"/>
                 <w:sz w:val="19"/>
               </w:rPr>
               <w:t>13.45</w:t>
@@ -2904,29 +2262,25 @@
         </w:tc>
         <w:tc>
           <w:tcPr>
-            <w:tcW w:type="dxa" w:w="1337"/>
+            <w:tcW w:type="dxa" w:w="1404"/>
             <w:vAlign w:val="center"/>
             <w:tcMar>
-              <w:top w:w="120" w:type="dxa"/>
-              <w:bottom w:w="120" w:type="dxa"/>
-              <w:left w:w="140" w:type="dxa"/>
-              <w:right w:w="140" w:type="dxa"/>
+              <w:top w:w="70" w:type="dxa"/>
+              <w:bottom w:w="70" w:type="dxa"/>
+              <w:left w:w="100" w:type="dxa"/>
+              <w:right w:w="100" w:type="dxa"/>
             </w:tcMar>
-            <w:shd w:fill="F7F9FB" w:val="clear"/>
+            <w:shd w:fill="FAFAFA" w:val="clear"/>
           </w:tcPr>
           <w:p>
             <w:pPr>
               <w:spacing w:before="0" w:after="0" w:line="240" w:lineRule="auto"/>
+              <w:jc w:val="center"/>
             </w:pPr>
             <w:r/>
             <w:r>
               <w:rPr>
-                <w:sz w:val="19"/>
-              </w:rPr>
-              <w:t>5.54</w:t>
-            </w:r>
-            <w:r>
-              <w:rPr>
+                <w:color w:val="111111"/>
                 <w:sz w:val="19"/>
               </w:rPr>
               <w:t>5.54</w:t>
@@ -2935,29 +2289,25 @@
         </w:tc>
         <w:tc>
           <w:tcPr>
-            <w:tcW w:type="dxa" w:w="1340"/>
+            <w:tcW w:type="dxa" w:w="1404"/>
             <w:vAlign w:val="center"/>
             <w:tcMar>
-              <w:top w:w="120" w:type="dxa"/>
-              <w:bottom w:w="120" w:type="dxa"/>
-              <w:left w:w="140" w:type="dxa"/>
-              <w:right w:w="140" w:type="dxa"/>
+              <w:top w:w="70" w:type="dxa"/>
+              <w:bottom w:w="70" w:type="dxa"/>
+              <w:left w:w="100" w:type="dxa"/>
+              <w:right w:w="100" w:type="dxa"/>
             </w:tcMar>
-            <w:shd w:fill="F7F9FB" w:val="clear"/>
+            <w:shd w:fill="FAFAFA" w:val="clear"/>
           </w:tcPr>
           <w:p>
             <w:pPr>
               <w:spacing w:before="0" w:after="0" w:line="240" w:lineRule="auto"/>
+              <w:jc w:val="center"/>
             </w:pPr>
             <w:r/>
             <w:r>
               <w:rPr>
-                <w:sz w:val="19"/>
-              </w:rPr>
-              <w:t>1.64</w:t>
-            </w:r>
-            <w:r>
-              <w:rPr>
+                <w:color w:val="111111"/>
                 <w:sz w:val="19"/>
               </w:rPr>
               <w:t>1.64</w:t>
@@ -2987,8 +2337,8 @@
       <w:r>
         <w:drawing>
           <wp:inline xmlns:a="http://schemas.openxmlformats.org/drawingml/2006/main" xmlns:pic="http://schemas.openxmlformats.org/drawingml/2006/picture">
-            <wp:extent cx="6217920" cy="2011680"/>
-            <wp:docPr id="5" name="Picture 5" descr="Dissolved oxygen concentration summary statistics box plot" title="Box Plot"/>
+            <wp:extent cx="5943600" cy="1700476"/>
+            <wp:docPr id="4" name="Picture 4" descr="Dissolved Oxygen Concentration (mg/l) in Streams with Temperatures Warmer than 8°C" title="Dissolved Oxygen Concentration (mg/l) in Streams with Temperatures Warmer than 8°C"/>
             <wp:cNvGraphicFramePr>
               <a:graphicFrameLocks noChangeAspect="1"/>
             </wp:cNvGraphicFramePr>
@@ -3000,7 +2350,7 @@
                     <pic:cNvPicPr/>
                   </pic:nvPicPr>
                   <pic:blipFill>
-                    <a:blip r:embed="rId13"/>
+                    <a:blip r:embed="rId12"/>
                     <a:stretch>
                       <a:fillRect/>
                     </a:stretch>
@@ -3008,7 +2358,7 @@
                   <pic:spPr>
                     <a:xfrm>
                       <a:off x="0" y="0"/>
-                      <a:ext cx="6217920" cy="2011680"/>
+                      <a:ext cx="5943600" cy="1700476"/>
                     </a:xfrm>
                     <a:prstGeom prst="rect"/>
                   </pic:spPr>
@@ -3111,8 +2461,7 @@
       </w:pPr>
       <w:r>
         <w:rPr>
-          <w:rFonts w:ascii="Times New Roman" w:hAnsi="Times New Roman"/>
-          <w:b w:val="0"/>
+          <w:b/>
           <w:i w:val="0"/>
           <w:strike w:val="0"/>
           <w:sz w:val="20"/>
@@ -3124,13 +2473,23 @@
     <w:p>
       <w:r>
         <w:rPr>
+          <w:b/>
+          <w:i w:val="0"/>
+          <w:strike w:val="0"/>
+          <w:sz w:val="20"/>
+          <w:u w:val="none"/>
+        </w:rPr>
+        <w:t xml:space="preserve">2. </w:t>
+      </w:r>
+      <w:r>
+        <w:rPr>
           <w:b w:val="0"/>
           <w:i w:val="0"/>
           <w:strike w:val="0"/>
           <w:sz w:val="20"/>
           <w:u w:val="none"/>
         </w:rPr>
-        <w:t>2. A local elementary school decided to sell bottles printed with the school district's logo as a fund-raiser. The students in the elementary school were asked to sell bottles in three different sizes (small, medium, and large). The relative frequencies of the number of bottles sold for each size by the elementary school were 0.5 for small bottles, 0.3 for medium bottles, and 0.2 for large bottles.</w:t>
+        <w:t>A local elementary school decided to sell bottles printed with the school district’s logo as a fund-raiser. The students in the elementary school were asked to sell bottles in three different sizes (small, medium, and large). The relative frequencies of the number of bottles sold for each size by the elementary school were 0.5 for small bottles, 0.3 for medium bottles, and 0.2 for large bottles.</w:t>
       </w:r>
     </w:p>
     <w:p>
@@ -3148,13 +2507,23 @@
     <w:p>
       <w:r>
         <w:rPr>
+          <w:b/>
+          <w:i w:val="0"/>
+          <w:strike w:val="0"/>
+          <w:sz w:val="20"/>
+          <w:u w:val="none"/>
+        </w:rPr>
+        <w:t xml:space="preserve">(a) </w:t>
+      </w:r>
+      <w:r>
+        <w:rPr>
           <w:b w:val="0"/>
           <w:i w:val="0"/>
           <w:strike w:val="0"/>
           <w:sz w:val="20"/>
           <w:u w:val="none"/>
         </w:rPr>
-        <w:t>(a) Complete the segmented bar graphs representing the relative frequencies of the number of bottles sold for each size by students at each school.</w:t>
+        <w:t>Complete the segmented bar graphs representing the relative frequencies of the number of bottles sold for each size by students at each school.</w:t>
       </w:r>
     </w:p>
     <w:p>
@@ -3167,8 +2536,8 @@
       <w:r>
         <w:drawing>
           <wp:inline xmlns:a="http://schemas.openxmlformats.org/drawingml/2006/main" xmlns:pic="http://schemas.openxmlformats.org/drawingml/2006/picture">
-            <wp:extent cx="5440680" cy="2057400"/>
-            <wp:docPr id="6" name="Picture 6" descr="Segmented bar graphs for bottle sales by school" title="Segmented Bar Graphs"/>
+            <wp:extent cx="3145536" cy="1066920"/>
+            <wp:docPr id="5" name="Picture 5" descr="Segmented bar graphs and key" title="Segmented bar graphs and key"/>
             <wp:cNvGraphicFramePr>
               <a:graphicFrameLocks noChangeAspect="1"/>
             </wp:cNvGraphicFramePr>
@@ -3180,7 +2549,7 @@
                     <pic:cNvPicPr/>
                   </pic:nvPicPr>
                   <pic:blipFill>
-                    <a:blip r:embed="rId14"/>
+                    <a:blip r:embed="rId13"/>
                     <a:stretch>
                       <a:fillRect/>
                     </a:stretch>
@@ -3188,7 +2557,7 @@
                   <pic:spPr>
                     <a:xfrm>
                       <a:off x="0" y="0"/>
-                      <a:ext cx="5440680" cy="2057400"/>
+                      <a:ext cx="3145536" cy="1066920"/>
                     </a:xfrm>
                     <a:prstGeom prst="rect"/>
                   </pic:spPr>
@@ -3200,6 +2569,30 @@
       </w:r>
     </w:p>
     <w:p>
+      <w:pPr>
+        <w:spacing w:before="40" w:after="120"/>
+        <w:jc w:val="center"/>
+      </w:pPr>
+      <w:r>
+        <w:rPr>
+          <w:i/>
+          <w:color w:val="666666"/>
+          <w:sz w:val="18"/>
+        </w:rPr>
+        <w:t>Segmented bar graphs and key</w:t>
+      </w:r>
+    </w:p>
+    <w:p>
+      <w:r>
+        <w:rPr>
+          <w:b/>
+          <w:i w:val="0"/>
+          <w:strike w:val="0"/>
+          <w:sz w:val="20"/>
+          <w:u w:val="none"/>
+        </w:rPr>
+        <w:t xml:space="preserve">(b) </w:t>
+      </w:r>
       <w:r>
         <w:rPr>
           <w:b w:val="0"/>
@@ -3208,7 +2601,7 @@
           <w:sz w:val="20"/>
           <w:u w:val="none"/>
         </w:rPr>
-        <w:t>(b) An administrator at the elementary school concluded that the elementary school students sold more bottles than the middle school students did. Is the elementary school administrator's conclusion correct? Explain your response.</w:t>
+        <w:t>An administrator at the elementary school concluded that the elementary school students sold more small bottles than the middle school students did. Is the elementary school administrator’s conclusion correct? Explain your response.</w:t>
       </w:r>
     </w:p>
     <w:p>
@@ -3217,8 +2610,7 @@
       </w:pPr>
       <w:r>
         <w:rPr>
-          <w:rFonts w:ascii="Times New Roman" w:hAnsi="Times New Roman"/>
-          <w:b w:val="0"/>
+          <w:b/>
           <w:i w:val="0"/>
           <w:strike w:val="0"/>
           <w:sz w:val="20"/>
@@ -3240,20 +2632,7 @@
           <w:u w:val="none"/>
         </w:rPr>
         <w:t>© 2024 College Board.</w:t>
-      </w:r>
-    </w:p>
-    <w:p>
-      <w:pPr>
-        <w:jc w:val="center"/>
-      </w:pPr>
-      <w:r>
-        <w:rPr>
-          <w:b w:val="0"/>
-          <w:i w:val="0"/>
-          <w:strike w:val="0"/>
-          <w:sz w:val="18"/>
-          <w:u w:val="none"/>
-        </w:rPr>
+        <w:br/>
         <w:t>Visit College Board on the web: collegeboard.org.</w:t>
       </w:r>
     </w:p>
@@ -3266,7 +2645,7 @@
           <w:b w:val="0"/>
           <w:i w:val="0"/>
           <w:strike w:val="0"/>
-          <w:sz w:val="18"/>
+          <w:sz w:val="20"/>
           <w:u w:val="none"/>
         </w:rPr>
         <w:t>5</w:t>
@@ -3283,6 +2662,7 @@
           <w:b w:val="0"/>
           <w:i w:val="0"/>
           <w:strike w:val="0"/>
+          <w:sz w:val="20"/>
           <w:u w:val="none"/>
         </w:rPr>
         <w:t>AP® Statistics 2024 Free-Response Questions</w:t>
@@ -3294,9 +2674,10 @@
       </w:pPr>
       <w:r>
         <w:rPr>
-          <w:b w:val="0"/>
+          <w:b/>
           <w:i w:val="0"/>
           <w:strike w:val="0"/>
+          <w:sz w:val="22"/>
           <w:u w:val="none"/>
         </w:rPr>
         <w:t>Continue your response to QUESTION 2 on this page.</w:t>
@@ -3308,6 +2689,7 @@
           <w:b w:val="0"/>
           <w:i w:val="0"/>
           <w:strike w:val="0"/>
+          <w:sz w:val="21"/>
           <w:u w:val="none"/>
         </w:rPr>
         <w:t>Two high schools are also selling the bottles and are competing to see which one sold more large bottles.</w:t>
@@ -3319,28 +2701,10 @@
           <w:b w:val="0"/>
           <w:i w:val="0"/>
           <w:strike w:val="0"/>
+          <w:sz w:val="21"/>
           <w:u w:val="none"/>
         </w:rPr>
         <w:t>(c) A mosaic plot for the distribution of the number of bottles sold by each of the high schools is shown here.</w:t>
-      </w:r>
-    </w:p>
-    <w:p>
-      <w:pPr>
-        <w:pStyle w:val="Heading3"/>
-        <w:keepNext/>
-        <w:spacing w:before="240" w:after="80"/>
-        <w:jc w:val="center"/>
-      </w:pPr>
-      <w:r>
-        <w:rPr>
-          <w:b/>
-          <w:i w:val="0"/>
-          <w:strike w:val="0"/>
-          <w:color w:val="1F4E79"/>
-          <w:sz w:val="32"/>
-          <w:u w:val="none"/>
-        </w:rPr>
-        <w:t>Distribution of the Number of Bottles Sold by High School</w:t>
       </w:r>
     </w:p>
     <w:p>
@@ -3353,8 +2717,8 @@
       <w:r>
         <w:drawing>
           <wp:inline xmlns:a="http://schemas.openxmlformats.org/drawingml/2006/main" xmlns:pic="http://schemas.openxmlformats.org/drawingml/2006/picture">
-            <wp:extent cx="3657600" cy="1231442"/>
-            <wp:docPr id="7" name="Picture 7" descr="High school bottle sales mosaic plot" title="Mosaic Plot"/>
+            <wp:extent cx="4572000" cy="2349462"/>
+            <wp:docPr id="6" name="Picture 6" descr="Distribution of the Number of Bottles Sold by High School" title="Distribution of the Number of Bottles Sold by High School"/>
             <wp:cNvGraphicFramePr>
               <a:graphicFrameLocks noChangeAspect="1"/>
             </wp:cNvGraphicFramePr>
@@ -3362,11 +2726,11 @@
               <a:graphicData uri="http://schemas.openxmlformats.org/drawingml/2006/picture">
                 <pic:pic>
                   <pic:nvPicPr>
-                    <pic:cNvPr id="0" name="chart_1981192773120.png"/>
+                    <pic:cNvPr id="0" name="chart_2823318173600.png"/>
                     <pic:cNvPicPr/>
                   </pic:nvPicPr>
                   <pic:blipFill>
-                    <a:blip r:embed="rId15"/>
+                    <a:blip r:embed="rId14"/>
                     <a:stretch>
                       <a:fillRect/>
                     </a:stretch>
@@ -3374,7 +2738,7 @@
                   <pic:spPr>
                     <a:xfrm>
                       <a:off x="0" y="0"/>
-                      <a:ext cx="3657600" cy="1231442"/>
+                      <a:ext cx="4572000" cy="2349462"/>
                     </a:xfrm>
                     <a:prstGeom prst="rect"/>
                   </pic:spPr>
@@ -3391,6 +2755,7 @@
           <w:b w:val="0"/>
           <w:i w:val="0"/>
           <w:strike w:val="0"/>
+          <w:sz w:val="21"/>
           <w:u w:val="none"/>
         </w:rPr>
         <w:t>(i) Which of the two high schools sold a greater proportion of large bottles? Justify your answer.</w:t>
@@ -3402,6 +2767,7 @@
           <w:b w:val="0"/>
           <w:i w:val="0"/>
           <w:strike w:val="0"/>
+          <w:sz w:val="21"/>
           <w:u w:val="none"/>
         </w:rPr>
         <w:t>(ii) Which of the two high schools sold a greater number of large bottles? Justify your answer.</w:t>
@@ -3416,6 +2782,7 @@
           <w:b/>
           <w:i w:val="0"/>
           <w:strike w:val="0"/>
+          <w:sz w:val="22"/>
           <w:u w:val="none"/>
         </w:rPr>
         <w:t>GO ON TO THE NEXT PAGE.</w:t>
@@ -3430,22 +2797,11 @@
           <w:b w:val="0"/>
           <w:i w:val="0"/>
           <w:strike w:val="0"/>
+          <w:sz w:val="18"/>
           <w:u w:val="none"/>
         </w:rPr>
         <w:t>© 2024 College Board.</w:t>
-      </w:r>
-    </w:p>
-    <w:p>
-      <w:pPr>
-        <w:jc w:val="center"/>
-      </w:pPr>
-      <w:r>
-        <w:rPr>
-          <w:b w:val="0"/>
-          <w:i w:val="0"/>
-          <w:strike w:val="0"/>
-          <w:u w:val="none"/>
-        </w:rPr>
+        <w:br/>
         <w:t>Visit College Board on the web: collegeboard.org.</w:t>
       </w:r>
     </w:p>
@@ -3458,6 +2814,7 @@
           <w:b w:val="0"/>
           <w:i w:val="0"/>
           <w:strike w:val="0"/>
+          <w:sz w:val="20"/>
           <w:u w:val="none"/>
         </w:rPr>
         <w:t>6</w:t>

</xml_diff>

<commit_message>
improve ast generation and rendering
</commit_message>
<xml_diff>
--- a/tests/stats_merged_quiz_multimodal.docx
+++ b/tests/stats_merged_quiz_multimodal.docx
@@ -5,7 +5,7 @@
     <w:p>
       <w:pPr>
         <w:keepNext/>
-        <w:spacing w:before="320" w:after="80"/>
+        <w:spacing w:before="240" w:after="60"/>
         <w:jc w:val="center"/>
       </w:pPr>
       <w:r>
@@ -43,6 +43,9 @@
       </w:r>
     </w:p>
     <w:p>
+      <w:pPr>
+        <w:spacing w:after="40"/>
+      </w:pPr>
       <w:r>
         <w:rPr>
           <w:b w:val="0"/>
@@ -64,6 +67,7 @@
     </w:p>
     <w:p>
       <w:pPr>
+        <w:spacing w:after="40"/>
         <w:jc w:val="center"/>
       </w:pPr>
       <w:r>
@@ -91,11 +95,11 @@
         </w:tblBorders>
       </w:tblPr>
       <w:tblGrid>
-        <w:gridCol w:w="1728"/>
-        <w:gridCol w:w="1728"/>
-        <w:gridCol w:w="1728"/>
-        <w:gridCol w:w="1728"/>
-        <w:gridCol w:w="1728"/>
+        <w:gridCol w:w="2128"/>
+        <w:gridCol w:w="2128"/>
+        <w:gridCol w:w="2128"/>
+        <w:gridCol w:w="2128"/>
+        <w:gridCol w:w="2128"/>
       </w:tblGrid>
       <w:tr>
         <w:trPr>
@@ -104,7 +108,7 @@
         </w:trPr>
         <w:tc>
           <w:tcPr>
-            <w:tcW w:type="dxa" w:w="1872"/>
+            <w:tcW w:type="dxa" w:w="2128"/>
             <w:vAlign w:val="center"/>
             <w:tcMar>
               <w:top w:w="70" w:type="dxa"/>
@@ -131,7 +135,7 @@
         </w:tc>
         <w:tc>
           <w:tcPr>
-            <w:tcW w:type="dxa" w:w="1872"/>
+            <w:tcW w:type="dxa" w:w="2128"/>
             <w:vAlign w:val="center"/>
             <w:tcMar>
               <w:top w:w="70" w:type="dxa"/>
@@ -159,7 +163,7 @@
         </w:tc>
         <w:tc>
           <w:tcPr>
-            <w:tcW w:type="dxa" w:w="1872"/>
+            <w:tcW w:type="dxa" w:w="2128"/>
             <w:vAlign w:val="center"/>
             <w:tcMar>
               <w:top w:w="70" w:type="dxa"/>
@@ -187,7 +191,7 @@
         </w:tc>
         <w:tc>
           <w:tcPr>
-            <w:tcW w:type="dxa" w:w="1872"/>
+            <w:tcW w:type="dxa" w:w="2128"/>
             <w:vAlign w:val="center"/>
             <w:tcMar>
               <w:top w:w="70" w:type="dxa"/>
@@ -215,7 +219,7 @@
         </w:tc>
         <w:tc>
           <w:tcPr>
-            <w:tcW w:type="dxa" w:w="1872"/>
+            <w:tcW w:type="dxa" w:w="2128"/>
             <w:vAlign w:val="center"/>
             <w:tcMar>
               <w:top w:w="70" w:type="dxa"/>
@@ -248,7 +252,7 @@
         </w:trPr>
         <w:tc>
           <w:tcPr>
-            <w:tcW w:type="dxa" w:w="1872"/>
+            <w:tcW w:type="dxa" w:w="2128"/>
             <w:vAlign w:val="center"/>
             <w:tcMar>
               <w:top w:w="70" w:type="dxa"/>
@@ -275,7 +279,7 @@
         </w:tc>
         <w:tc>
           <w:tcPr>
-            <w:tcW w:type="dxa" w:w="1872"/>
+            <w:tcW w:type="dxa" w:w="2128"/>
             <w:vAlign w:val="center"/>
             <w:tcMar>
               <w:top w:w="70" w:type="dxa"/>
@@ -302,7 +306,7 @@
         </w:tc>
         <w:tc>
           <w:tcPr>
-            <w:tcW w:type="dxa" w:w="1872"/>
+            <w:tcW w:type="dxa" w:w="2128"/>
             <w:vAlign w:val="center"/>
             <w:tcMar>
               <w:top w:w="70" w:type="dxa"/>
@@ -329,7 +333,7 @@
         </w:tc>
         <w:tc>
           <w:tcPr>
-            <w:tcW w:type="dxa" w:w="1872"/>
+            <w:tcW w:type="dxa" w:w="2128"/>
             <w:vAlign w:val="center"/>
             <w:tcMar>
               <w:top w:w="70" w:type="dxa"/>
@@ -356,7 +360,7 @@
         </w:tc>
         <w:tc>
           <w:tcPr>
-            <w:tcW w:type="dxa" w:w="1872"/>
+            <w:tcW w:type="dxa" w:w="2128"/>
             <w:vAlign w:val="center"/>
             <w:tcMar>
               <w:top w:w="70" w:type="dxa"/>
@@ -388,7 +392,7 @@
         </w:trPr>
         <w:tc>
           <w:tcPr>
-            <w:tcW w:type="dxa" w:w="1872"/>
+            <w:tcW w:type="dxa" w:w="2128"/>
             <w:vAlign w:val="center"/>
             <w:tcMar>
               <w:top w:w="70" w:type="dxa"/>
@@ -414,7 +418,7 @@
         </w:tc>
         <w:tc>
           <w:tcPr>
-            <w:tcW w:type="dxa" w:w="1872"/>
+            <w:tcW w:type="dxa" w:w="2128"/>
             <w:vAlign w:val="center"/>
             <w:tcMar>
               <w:top w:w="70" w:type="dxa"/>
@@ -440,7 +444,7 @@
         </w:tc>
         <w:tc>
           <w:tcPr>
-            <w:tcW w:type="dxa" w:w="1872"/>
+            <w:tcW w:type="dxa" w:w="2128"/>
             <w:vAlign w:val="center"/>
             <w:tcMar>
               <w:top w:w="70" w:type="dxa"/>
@@ -466,7 +470,7 @@
         </w:tc>
         <w:tc>
           <w:tcPr>
-            <w:tcW w:type="dxa" w:w="1872"/>
+            <w:tcW w:type="dxa" w:w="2128"/>
             <w:vAlign w:val="center"/>
             <w:tcMar>
               <w:top w:w="70" w:type="dxa"/>
@@ -492,7 +496,7 @@
         </w:tc>
         <w:tc>
           <w:tcPr>
-            <w:tcW w:type="dxa" w:w="1872"/>
+            <w:tcW w:type="dxa" w:w="2128"/>
             <w:vAlign w:val="center"/>
             <w:tcMar>
               <w:top w:w="70" w:type="dxa"/>
@@ -523,7 +527,7 @@
         </w:trPr>
         <w:tc>
           <w:tcPr>
-            <w:tcW w:type="dxa" w:w="1872"/>
+            <w:tcW w:type="dxa" w:w="2128"/>
             <w:vAlign w:val="center"/>
             <w:tcMar>
               <w:top w:w="70" w:type="dxa"/>
@@ -531,7 +535,6 @@
               <w:left w:w="100" w:type="dxa"/>
               <w:right w:w="100" w:type="dxa"/>
             </w:tcMar>
-            <w:shd w:fill="FAFAFA" w:val="clear"/>
           </w:tcPr>
           <w:p>
             <w:pPr>
@@ -541,6 +544,7 @@
             <w:r/>
             <w:r>
               <w:rPr>
+                <w:b/>
                 <w:color w:val="111111"/>
                 <w:sz w:val="19"/>
               </w:rPr>
@@ -550,7 +554,7 @@
         </w:tc>
         <w:tc>
           <w:tcPr>
-            <w:tcW w:type="dxa" w:w="1872"/>
+            <w:tcW w:type="dxa" w:w="2128"/>
             <w:vAlign w:val="center"/>
             <w:tcMar>
               <w:top w:w="70" w:type="dxa"/>
@@ -558,7 +562,6 @@
               <w:left w:w="100" w:type="dxa"/>
               <w:right w:w="100" w:type="dxa"/>
             </w:tcMar>
-            <w:shd w:fill="FAFAFA" w:val="clear"/>
           </w:tcPr>
           <w:p>
             <w:pPr>
@@ -568,6 +571,7 @@
             <w:r/>
             <w:r>
               <w:rPr>
+                <w:b/>
                 <w:color w:val="111111"/>
                 <w:sz w:val="19"/>
               </w:rPr>
@@ -577,7 +581,7 @@
         </w:tc>
         <w:tc>
           <w:tcPr>
-            <w:tcW w:type="dxa" w:w="1872"/>
+            <w:tcW w:type="dxa" w:w="2128"/>
             <w:vAlign w:val="center"/>
             <w:tcMar>
               <w:top w:w="70" w:type="dxa"/>
@@ -585,7 +589,6 @@
               <w:left w:w="100" w:type="dxa"/>
               <w:right w:w="100" w:type="dxa"/>
             </w:tcMar>
-            <w:shd w:fill="FAFAFA" w:val="clear"/>
           </w:tcPr>
           <w:p>
             <w:pPr>
@@ -595,6 +598,7 @@
             <w:r/>
             <w:r>
               <w:rPr>
+                <w:b/>
                 <w:color w:val="111111"/>
                 <w:sz w:val="19"/>
               </w:rPr>
@@ -604,7 +608,7 @@
         </w:tc>
         <w:tc>
           <w:tcPr>
-            <w:tcW w:type="dxa" w:w="1872"/>
+            <w:tcW w:type="dxa" w:w="2128"/>
             <w:vAlign w:val="center"/>
             <w:tcMar>
               <w:top w:w="70" w:type="dxa"/>
@@ -612,7 +616,6 @@
               <w:left w:w="100" w:type="dxa"/>
               <w:right w:w="100" w:type="dxa"/>
             </w:tcMar>
-            <w:shd w:fill="FAFAFA" w:val="clear"/>
           </w:tcPr>
           <w:p>
             <w:pPr>
@@ -622,6 +625,7 @@
             <w:r/>
             <w:r>
               <w:rPr>
+                <w:b/>
                 <w:color w:val="111111"/>
                 <w:sz w:val="19"/>
               </w:rPr>
@@ -631,7 +635,7 @@
         </w:tc>
         <w:tc>
           <w:tcPr>
-            <w:tcW w:type="dxa" w:w="1872"/>
+            <w:tcW w:type="dxa" w:w="2128"/>
             <w:vAlign w:val="center"/>
             <w:tcMar>
               <w:top w:w="70" w:type="dxa"/>
@@ -639,7 +643,6 @@
               <w:left w:w="100" w:type="dxa"/>
               <w:right w:w="100" w:type="dxa"/>
             </w:tcMar>
-            <w:shd w:fill="FAFAFA" w:val="clear"/>
           </w:tcPr>
           <w:p>
             <w:pPr>
@@ -649,6 +652,7 @@
             <w:r/>
             <w:r>
               <w:rPr>
+                <w:b/>
                 <w:color w:val="111111"/>
                 <w:sz w:val="19"/>
               </w:rPr>
@@ -659,6 +663,9 @@
       </w:tr>
     </w:tbl>
     <w:p>
+      <w:pPr>
+        <w:spacing w:after="40"/>
+      </w:pPr>
       <w:r>
         <w:rPr>
           <w:b w:val="0"/>
@@ -670,6 +677,9 @@
       </w:r>
     </w:p>
     <w:p>
+      <w:pPr>
+        <w:spacing w:after="40"/>
+      </w:pPr>
       <w:r>
         <w:rPr>
           <w:b w:val="0"/>
@@ -681,6 +691,9 @@
       </w:r>
     </w:p>
     <w:p>
+      <w:pPr>
+        <w:spacing w:after="40"/>
+      </w:pPr>
       <w:r>
         <w:rPr>
           <w:b w:val="0"/>
@@ -693,6 +706,7 @@
     </w:p>
     <w:p>
       <w:pPr>
+        <w:spacing w:after="40"/>
         <w:jc w:val="center"/>
       </w:pPr>
       <w:r>
@@ -748,6 +762,9 @@
       </w:r>
     </w:p>
     <w:p>
+      <w:pPr>
+        <w:spacing w:after="40"/>
+      </w:pPr>
       <w:r>
         <w:rPr>
           <w:b w:val="0"/>
@@ -760,6 +777,7 @@
     </w:p>
     <w:p>
       <w:pPr>
+        <w:spacing w:after="40"/>
         <w:jc w:val="center"/>
       </w:pPr>
       <w:r>
@@ -816,6 +834,7 @@
     </w:p>
     <w:p>
       <w:pPr>
+        <w:spacing w:after="40"/>
         <w:jc w:val="center"/>
       </w:pPr>
       <w:r>
@@ -830,6 +849,7 @@
     </w:p>
     <w:p>
       <w:pPr>
+        <w:spacing w:after="40"/>
         <w:jc w:val="right"/>
       </w:pPr>
       <w:r>
@@ -844,6 +864,7 @@
     </w:p>
     <w:p>
       <w:pPr>
+        <w:spacing w:after="40"/>
         <w:jc w:val="center"/>
       </w:pPr>
       <w:r>
@@ -862,6 +883,9 @@
       </w:r>
     </w:p>
     <w:p>
+      <w:pPr>
+        <w:spacing w:after="40"/>
+      </w:pPr>
       <w:r>
         <w:rPr>
           <w:rFonts w:ascii="TimesNewRoman" w:hAnsi="TimesNewRoman"/>
@@ -876,6 +900,7 @@
     </w:p>
     <w:p>
       <w:pPr>
+        <w:spacing w:after="40"/>
         <w:jc w:val="center"/>
       </w:pPr>
       <w:r>
@@ -893,7 +918,7 @@
     <w:p>
       <w:pPr>
         <w:keepNext/>
-        <w:spacing w:before="320" w:after="80"/>
+        <w:spacing w:before="240" w:after="60"/>
         <w:jc w:val="center"/>
       </w:pPr>
       <w:r>
@@ -912,7 +937,7 @@
     <w:p>
       <w:pPr>
         <w:keepNext/>
-        <w:spacing w:before="280" w:after="80"/>
+        <w:spacing w:before="200" w:after="60"/>
         <w:jc w:val="center"/>
       </w:pPr>
       <w:r>
@@ -930,6 +955,7 @@
     </w:p>
     <w:p>
       <w:pPr>
+        <w:spacing w:after="40"/>
         <w:jc w:val="center"/>
       </w:pPr>
       <w:r>
@@ -946,6 +972,7 @@
     </w:p>
     <w:p>
       <w:pPr>
+        <w:spacing w:after="40"/>
         <w:jc w:val="center"/>
       </w:pPr>
       <w:r>
@@ -963,7 +990,7 @@
     <w:p>
       <w:pPr>
         <w:keepNext/>
-        <w:spacing w:before="240" w:after="80"/>
+        <w:spacing w:before="160" w:after="60"/>
         <w:jc w:val="center"/>
       </w:pPr>
       <w:r>
@@ -981,6 +1008,7 @@
     </w:p>
     <w:p>
       <w:pPr>
+        <w:spacing w:after="40"/>
         <w:jc w:val="center"/>
       </w:pPr>
       <w:r>
@@ -997,6 +1025,7 @@
     </w:p>
     <w:p>
       <w:pPr>
+        <w:spacing w:after="40"/>
         <w:jc w:val="center"/>
       </w:pPr>
       <w:r>
@@ -1012,6 +1041,9 @@
       </w:r>
     </w:p>
     <w:p>
+      <w:pPr>
+        <w:spacing w:after="40"/>
+      </w:pPr>
       <w:r>
         <w:rPr>
           <w:rFonts w:ascii="TimesNewRoman" w:hAnsi="TimesNewRoman"/>
@@ -1036,6 +1068,9 @@
       </w:r>
     </w:p>
     <w:p>
+      <w:pPr>
+        <w:spacing w:after="40"/>
+      </w:pPr>
       <w:r>
         <w:rPr>
           <w:rFonts w:ascii="TimesNewRoman" w:hAnsi="TimesNewRoman"/>
@@ -1063,14 +1098,14 @@
         </w:tblBorders>
       </w:tblPr>
       <w:tblGrid>
-        <w:gridCol w:w="1080"/>
-        <w:gridCol w:w="1080"/>
-        <w:gridCol w:w="1080"/>
-        <w:gridCol w:w="1080"/>
-        <w:gridCol w:w="1080"/>
-        <w:gridCol w:w="1080"/>
-        <w:gridCol w:w="1080"/>
-        <w:gridCol w:w="1080"/>
+        <w:gridCol w:w="1330"/>
+        <w:gridCol w:w="1330"/>
+        <w:gridCol w:w="1330"/>
+        <w:gridCol w:w="1330"/>
+        <w:gridCol w:w="1330"/>
+        <w:gridCol w:w="1330"/>
+        <w:gridCol w:w="1330"/>
+        <w:gridCol w:w="1330"/>
       </w:tblGrid>
       <w:tr>
         <w:trPr>
@@ -1079,7 +1114,7 @@
         </w:trPr>
         <w:tc>
           <w:tcPr>
-            <w:tcW w:type="dxa" w:w="3276"/>
+            <w:tcW w:type="dxa" w:w="3724"/>
             <w:vAlign w:val="center"/>
             <w:tcMar>
               <w:top w:w="70" w:type="dxa"/>
@@ -1107,7 +1142,7 @@
         </w:tc>
         <w:tc>
           <w:tcPr>
-            <w:tcW w:type="dxa" w:w="842"/>
+            <w:tcW w:type="dxa" w:w="958"/>
             <w:vAlign w:val="center"/>
             <w:tcMar>
               <w:top w:w="70" w:type="dxa"/>
@@ -1135,7 +1170,7 @@
         </w:tc>
         <w:tc>
           <w:tcPr>
-            <w:tcW w:type="dxa" w:w="842"/>
+            <w:tcW w:type="dxa" w:w="958"/>
             <w:vAlign w:val="center"/>
             <w:tcMar>
               <w:top w:w="70" w:type="dxa"/>
@@ -1163,7 +1198,7 @@
         </w:tc>
         <w:tc>
           <w:tcPr>
-            <w:tcW w:type="dxa" w:w="842"/>
+            <w:tcW w:type="dxa" w:w="958"/>
             <w:vAlign w:val="center"/>
             <w:tcMar>
               <w:top w:w="70" w:type="dxa"/>
@@ -1191,7 +1226,7 @@
         </w:tc>
         <w:tc>
           <w:tcPr>
-            <w:tcW w:type="dxa" w:w="842"/>
+            <w:tcW w:type="dxa" w:w="958"/>
             <w:vAlign w:val="center"/>
             <w:tcMar>
               <w:top w:w="70" w:type="dxa"/>
@@ -1219,7 +1254,7 @@
         </w:tc>
         <w:tc>
           <w:tcPr>
-            <w:tcW w:type="dxa" w:w="842"/>
+            <w:tcW w:type="dxa" w:w="958"/>
             <w:vAlign w:val="center"/>
             <w:tcMar>
               <w:top w:w="70" w:type="dxa"/>
@@ -1247,7 +1282,7 @@
         </w:tc>
         <w:tc>
           <w:tcPr>
-            <w:tcW w:type="dxa" w:w="936"/>
+            <w:tcW w:type="dxa" w:w="1064"/>
             <w:vAlign w:val="center"/>
             <w:tcMar>
               <w:top w:w="70" w:type="dxa"/>
@@ -1275,7 +1310,7 @@
         </w:tc>
         <w:tc>
           <w:tcPr>
-            <w:tcW w:type="dxa" w:w="936"/>
+            <w:tcW w:type="dxa" w:w="1064"/>
             <w:vAlign w:val="center"/>
             <w:tcMar>
               <w:top w:w="70" w:type="dxa"/>
@@ -1308,7 +1343,7 @@
         </w:trPr>
         <w:tc>
           <w:tcPr>
-            <w:tcW w:type="dxa" w:w="3276"/>
+            <w:tcW w:type="dxa" w:w="3724"/>
             <w:vAlign w:val="center"/>
             <w:tcMar>
               <w:top w:w="70" w:type="dxa"/>
@@ -1335,7 +1370,7 @@
         </w:tc>
         <w:tc>
           <w:tcPr>
-            <w:tcW w:type="dxa" w:w="842"/>
+            <w:tcW w:type="dxa" w:w="958"/>
             <w:vAlign w:val="center"/>
             <w:tcMar>
               <w:top w:w="70" w:type="dxa"/>
@@ -1362,7 +1397,7 @@
         </w:tc>
         <w:tc>
           <w:tcPr>
-            <w:tcW w:type="dxa" w:w="842"/>
+            <w:tcW w:type="dxa" w:w="958"/>
             <w:vAlign w:val="center"/>
             <w:tcMar>
               <w:top w:w="70" w:type="dxa"/>
@@ -1389,7 +1424,7 @@
         </w:tc>
         <w:tc>
           <w:tcPr>
-            <w:tcW w:type="dxa" w:w="842"/>
+            <w:tcW w:type="dxa" w:w="958"/>
             <w:vAlign w:val="center"/>
             <w:tcMar>
               <w:top w:w="70" w:type="dxa"/>
@@ -1416,7 +1451,7 @@
         </w:tc>
         <w:tc>
           <w:tcPr>
-            <w:tcW w:type="dxa" w:w="842"/>
+            <w:tcW w:type="dxa" w:w="958"/>
             <w:vAlign w:val="center"/>
             <w:tcMar>
               <w:top w:w="70" w:type="dxa"/>
@@ -1443,7 +1478,7 @@
         </w:tc>
         <w:tc>
           <w:tcPr>
-            <w:tcW w:type="dxa" w:w="842"/>
+            <w:tcW w:type="dxa" w:w="958"/>
             <w:vAlign w:val="center"/>
             <w:tcMar>
               <w:top w:w="70" w:type="dxa"/>
@@ -1470,7 +1505,7 @@
         </w:tc>
         <w:tc>
           <w:tcPr>
-            <w:tcW w:type="dxa" w:w="936"/>
+            <w:tcW w:type="dxa" w:w="1064"/>
             <w:vAlign w:val="center"/>
             <w:tcMar>
               <w:top w:w="70" w:type="dxa"/>
@@ -1497,7 +1532,7 @@
         </w:tc>
         <w:tc>
           <w:tcPr>
-            <w:tcW w:type="dxa" w:w="936"/>
+            <w:tcW w:type="dxa" w:w="1064"/>
             <w:vAlign w:val="center"/>
             <w:tcMar>
               <w:top w:w="70" w:type="dxa"/>
@@ -1534,7 +1569,7 @@
       <w:r>
         <w:drawing>
           <wp:inline xmlns:a="http://schemas.openxmlformats.org/drawingml/2006/main" xmlns:pic="http://schemas.openxmlformats.org/drawingml/2006/picture">
-            <wp:extent cx="3108960" cy="1596493"/>
+            <wp:extent cx="3108960" cy="1736078"/>
             <wp:docPr id="3" name="Picture 3" descr="Length of Stay (days)" title="Length of Stay (days)"/>
             <wp:cNvGraphicFramePr>
               <a:graphicFrameLocks noChangeAspect="1"/>
@@ -1555,7 +1590,7 @@
                   <pic:spPr>
                     <a:xfrm>
                       <a:off x="0" y="0"/>
-                      <a:ext cx="3108960" cy="1596493"/>
+                      <a:ext cx="3108960" cy="1736078"/>
                     </a:xfrm>
                     <a:prstGeom prst="rect"/>
                   </pic:spPr>
@@ -1581,6 +1616,9 @@
       </w:r>
     </w:p>
     <w:p>
+      <w:pPr>
+        <w:spacing w:after="40"/>
+      </w:pPr>
       <w:r>
         <w:rPr>
           <w:rFonts w:ascii="TimesNewRoman" w:hAnsi="TimesNewRoman"/>
@@ -1595,6 +1633,7 @@
     </w:p>
     <w:p>
       <w:pPr>
+        <w:spacing w:after="40"/>
         <w:jc w:val="right"/>
       </w:pPr>
       <w:r>
@@ -1611,6 +1650,7 @@
     </w:p>
     <w:p>
       <w:pPr>
+        <w:spacing w:after="40"/>
         <w:jc w:val="center"/>
       </w:pPr>
       <w:r>
@@ -1627,6 +1667,7 @@
     </w:p>
     <w:p>
       <w:pPr>
+        <w:spacing w:after="40"/>
         <w:jc w:val="center"/>
       </w:pPr>
       <w:r>
@@ -1645,6 +1686,7 @@
     </w:p>
     <w:p>
       <w:pPr>
+        <w:spacing w:after="40"/>
         <w:jc w:val="center"/>
       </w:pPr>
       <w:r>
@@ -1665,6 +1707,9 @@
       </w:r>
     </w:p>
     <w:p>
+      <w:pPr>
+        <w:spacing w:after="40"/>
+      </w:pPr>
       <w:r>
         <w:rPr>
           <w:b w:val="0"/>
@@ -1695,6 +1740,7 @@
     </w:p>
     <w:p>
       <w:pPr>
+        <w:spacing w:after="40"/>
         <w:jc w:val="center"/>
       </w:pPr>
       <w:r>
@@ -1708,6 +1754,9 @@
       </w:r>
     </w:p>
     <w:p>
+      <w:pPr>
+        <w:spacing w:after="40"/>
+      </w:pPr>
       <w:r>
         <w:rPr>
           <w:b w:val="0"/>
@@ -1755,6 +1804,9 @@
       </w:r>
     </w:p>
     <w:p>
+      <w:pPr>
+        <w:spacing w:after="40"/>
+      </w:pPr>
       <w:r>
         <w:rPr>
           <w:b w:val="0"/>
@@ -1776,6 +1828,9 @@
       </w:r>
     </w:p>
     <w:p>
+      <w:pPr>
+        <w:spacing w:after="40"/>
+      </w:pPr>
       <w:r>
         <w:rPr>
           <w:b w:val="0"/>
@@ -1791,6 +1846,9 @@
       </w:r>
     </w:p>
     <w:p>
+      <w:pPr>
+        <w:spacing w:after="40"/>
+      </w:pPr>
       <w:r>
         <w:rPr>
           <w:b w:val="0"/>
@@ -1805,6 +1863,7 @@
     </w:p>
     <w:p>
       <w:pPr>
+        <w:spacing w:after="40"/>
         <w:jc w:val="right"/>
       </w:pPr>
       <w:r>
@@ -1819,6 +1878,7 @@
     </w:p>
     <w:p>
       <w:pPr>
+        <w:spacing w:after="40"/>
         <w:jc w:val="center"/>
       </w:pPr>
       <w:r>
@@ -1833,6 +1893,7 @@
     </w:p>
     <w:p>
       <w:pPr>
+        <w:spacing w:after="40"/>
         <w:jc w:val="center"/>
       </w:pPr>
       <w:r>
@@ -1849,6 +1910,7 @@
     </w:p>
     <w:p>
       <w:pPr>
+        <w:spacing w:after="40"/>
         <w:jc w:val="center"/>
       </w:pPr>
       <w:r>
@@ -1872,6 +1934,9 @@
       </w:r>
     </w:p>
     <w:p>
+      <w:pPr>
+        <w:spacing w:after="40"/>
+      </w:pPr>
       <w:r>
         <w:rPr>
           <w:b w:val="0"/>
@@ -1884,6 +1949,7 @@
     </w:p>
     <w:p>
       <w:pPr>
+        <w:spacing w:after="40"/>
         <w:jc w:val="center"/>
       </w:pPr>
       <w:r>
@@ -1911,13 +1977,13 @@
         </w:tblBorders>
       </w:tblPr>
       <w:tblGrid>
-        <w:gridCol w:w="1234"/>
-        <w:gridCol w:w="1234"/>
-        <w:gridCol w:w="1234"/>
-        <w:gridCol w:w="1234"/>
-        <w:gridCol w:w="1234"/>
-        <w:gridCol w:w="1234"/>
-        <w:gridCol w:w="1234"/>
+        <w:gridCol w:w="1520"/>
+        <w:gridCol w:w="1520"/>
+        <w:gridCol w:w="1520"/>
+        <w:gridCol w:w="1520"/>
+        <w:gridCol w:w="1520"/>
+        <w:gridCol w:w="1520"/>
+        <w:gridCol w:w="1520"/>
       </w:tblGrid>
       <w:tr>
         <w:trPr>
@@ -1926,7 +1992,7 @@
         </w:trPr>
         <w:tc>
           <w:tcPr>
-            <w:tcW w:type="dxa" w:w="1310"/>
+            <w:tcW w:type="dxa" w:w="1490"/>
             <w:vAlign w:val="center"/>
             <w:tcMar>
               <w:top w:w="70" w:type="dxa"/>
@@ -1954,7 +2020,7 @@
         </w:tc>
         <w:tc>
           <w:tcPr>
-            <w:tcW w:type="dxa" w:w="1310"/>
+            <w:tcW w:type="dxa" w:w="1490"/>
             <w:vAlign w:val="center"/>
             <w:tcMar>
               <w:top w:w="70" w:type="dxa"/>
@@ -1982,7 +2048,7 @@
         </w:tc>
         <w:tc>
           <w:tcPr>
-            <w:tcW w:type="dxa" w:w="1310"/>
+            <w:tcW w:type="dxa" w:w="1490"/>
             <w:vAlign w:val="center"/>
             <w:tcMar>
               <w:top w:w="70" w:type="dxa"/>
@@ -2010,7 +2076,7 @@
         </w:tc>
         <w:tc>
           <w:tcPr>
-            <w:tcW w:type="dxa" w:w="1310"/>
+            <w:tcW w:type="dxa" w:w="1490"/>
             <w:vAlign w:val="center"/>
             <w:tcMar>
               <w:top w:w="70" w:type="dxa"/>
@@ -2038,7 +2104,7 @@
         </w:tc>
         <w:tc>
           <w:tcPr>
-            <w:tcW w:type="dxa" w:w="1310"/>
+            <w:tcW w:type="dxa" w:w="1490"/>
             <w:vAlign w:val="center"/>
             <w:tcMar>
               <w:top w:w="70" w:type="dxa"/>
@@ -2066,7 +2132,7 @@
         </w:tc>
         <w:tc>
           <w:tcPr>
-            <w:tcW w:type="dxa" w:w="1404"/>
+            <w:tcW w:type="dxa" w:w="1596"/>
             <w:vAlign w:val="center"/>
             <w:tcMar>
               <w:top w:w="70" w:type="dxa"/>
@@ -2094,7 +2160,7 @@
         </w:tc>
         <w:tc>
           <w:tcPr>
-            <w:tcW w:type="dxa" w:w="1404"/>
+            <w:tcW w:type="dxa" w:w="1596"/>
             <w:vAlign w:val="center"/>
             <w:tcMar>
               <w:top w:w="70" w:type="dxa"/>
@@ -2127,7 +2193,7 @@
         </w:trPr>
         <w:tc>
           <w:tcPr>
-            <w:tcW w:type="dxa" w:w="1310"/>
+            <w:tcW w:type="dxa" w:w="1490"/>
             <w:vAlign w:val="center"/>
             <w:tcMar>
               <w:top w:w="70" w:type="dxa"/>
@@ -2154,7 +2220,7 @@
         </w:tc>
         <w:tc>
           <w:tcPr>
-            <w:tcW w:type="dxa" w:w="1310"/>
+            <w:tcW w:type="dxa" w:w="1490"/>
             <w:vAlign w:val="center"/>
             <w:tcMar>
               <w:top w:w="70" w:type="dxa"/>
@@ -2181,7 +2247,7 @@
         </w:tc>
         <w:tc>
           <w:tcPr>
-            <w:tcW w:type="dxa" w:w="1310"/>
+            <w:tcW w:type="dxa" w:w="1490"/>
             <w:vAlign w:val="center"/>
             <w:tcMar>
               <w:top w:w="70" w:type="dxa"/>
@@ -2208,7 +2274,7 @@
         </w:tc>
         <w:tc>
           <w:tcPr>
-            <w:tcW w:type="dxa" w:w="1310"/>
+            <w:tcW w:type="dxa" w:w="1490"/>
             <w:vAlign w:val="center"/>
             <w:tcMar>
               <w:top w:w="70" w:type="dxa"/>
@@ -2235,7 +2301,7 @@
         </w:tc>
         <w:tc>
           <w:tcPr>
-            <w:tcW w:type="dxa" w:w="1310"/>
+            <w:tcW w:type="dxa" w:w="1490"/>
             <w:vAlign w:val="center"/>
             <w:tcMar>
               <w:top w:w="70" w:type="dxa"/>
@@ -2262,7 +2328,7 @@
         </w:tc>
         <w:tc>
           <w:tcPr>
-            <w:tcW w:type="dxa" w:w="1404"/>
+            <w:tcW w:type="dxa" w:w="1596"/>
             <w:vAlign w:val="center"/>
             <w:tcMar>
               <w:top w:w="70" w:type="dxa"/>
@@ -2289,7 +2355,7 @@
         </w:tc>
         <w:tc>
           <w:tcPr>
-            <w:tcW w:type="dxa" w:w="1404"/>
+            <w:tcW w:type="dxa" w:w="1596"/>
             <w:vAlign w:val="center"/>
             <w:tcMar>
               <w:top w:w="70" w:type="dxa"/>
@@ -2317,6 +2383,9 @@
       </w:tr>
     </w:tbl>
     <w:p>
+      <w:pPr>
+        <w:spacing w:after="40"/>
+      </w:pPr>
       <w:r>
         <w:rPr>
           <w:b w:val="0"/>
@@ -2337,7 +2406,7 @@
       <w:r>
         <w:drawing>
           <wp:inline xmlns:a="http://schemas.openxmlformats.org/drawingml/2006/main" xmlns:pic="http://schemas.openxmlformats.org/drawingml/2006/picture">
-            <wp:extent cx="5943600" cy="1700476"/>
+            <wp:extent cx="5943600" cy="1672245"/>
             <wp:docPr id="4" name="Picture 4" descr="Dissolved Oxygen Concentration (mg/l) in Streams with Temperatures Warmer than 8°C" title="Dissolved Oxygen Concentration (mg/l) in Streams with Temperatures Warmer than 8°C"/>
             <wp:cNvGraphicFramePr>
               <a:graphicFrameLocks noChangeAspect="1"/>
@@ -2358,7 +2427,7 @@
                   <pic:spPr>
                     <a:xfrm>
                       <a:off x="0" y="0"/>
-                      <a:ext cx="5943600" cy="1700476"/>
+                      <a:ext cx="5943600" cy="1672245"/>
                     </a:xfrm>
                     <a:prstGeom prst="rect"/>
                   </pic:spPr>
@@ -2384,6 +2453,9 @@
       </w:r>
     </w:p>
     <w:p>
+      <w:pPr>
+        <w:spacing w:after="40"/>
+      </w:pPr>
       <w:r>
         <w:rPr>
           <w:b w:val="0"/>
@@ -2396,6 +2468,7 @@
     </w:p>
     <w:p>
       <w:pPr>
+        <w:spacing w:after="40"/>
         <w:jc w:val="right"/>
       </w:pPr>
       <w:r>
@@ -2410,6 +2483,7 @@
     </w:p>
     <w:p>
       <w:pPr>
+        <w:spacing w:after="40"/>
         <w:jc w:val="center"/>
       </w:pPr>
       <w:r>
@@ -2426,6 +2500,7 @@
     </w:p>
     <w:p>
       <w:pPr>
+        <w:spacing w:after="40"/>
         <w:jc w:val="center"/>
       </w:pPr>
       <w:r>
@@ -2444,6 +2519,9 @@
       </w:r>
     </w:p>
     <w:p>
+      <w:pPr>
+        <w:spacing w:after="40"/>
+      </w:pPr>
       <w:r>
         <w:rPr>
           <w:b w:val="0"/>
@@ -2457,6 +2535,7 @@
     </w:p>
     <w:p>
       <w:pPr>
+        <w:spacing w:after="40"/>
         <w:jc w:val="center"/>
       </w:pPr>
       <w:r>
@@ -2471,6 +2550,9 @@
       </w:r>
     </w:p>
     <w:p>
+      <w:pPr>
+        <w:spacing w:after="40"/>
+      </w:pPr>
       <w:r>
         <w:rPr>
           <w:b/>
@@ -2493,6 +2575,9 @@
       </w:r>
     </w:p>
     <w:p>
+      <w:pPr>
+        <w:spacing w:after="40"/>
+      </w:pPr>
       <w:r>
         <w:rPr>
           <w:b w:val="0"/>
@@ -2505,6 +2590,9 @@
       </w:r>
     </w:p>
     <w:p>
+      <w:pPr>
+        <w:spacing w:after="40"/>
+      </w:pPr>
       <w:r>
         <w:rPr>
           <w:b/>
@@ -2536,7 +2624,7 @@
       <w:r>
         <w:drawing>
           <wp:inline xmlns:a="http://schemas.openxmlformats.org/drawingml/2006/main" xmlns:pic="http://schemas.openxmlformats.org/drawingml/2006/picture">
-            <wp:extent cx="3145536" cy="1066920"/>
+            <wp:extent cx="3145536" cy="1513676"/>
             <wp:docPr id="5" name="Picture 5" descr="Segmented bar graphs and key" title="Segmented bar graphs and key"/>
             <wp:cNvGraphicFramePr>
               <a:graphicFrameLocks noChangeAspect="1"/>
@@ -2557,7 +2645,7 @@
                   <pic:spPr>
                     <a:xfrm>
                       <a:off x="0" y="0"/>
-                      <a:ext cx="3145536" cy="1066920"/>
+                      <a:ext cx="3145536" cy="1513676"/>
                     </a:xfrm>
                     <a:prstGeom prst="rect"/>
                   </pic:spPr>
@@ -2583,6 +2671,9 @@
       </w:r>
     </w:p>
     <w:p>
+      <w:pPr>
+        <w:spacing w:after="40"/>
+      </w:pPr>
       <w:r>
         <w:rPr>
           <w:b/>
@@ -2606,6 +2697,7 @@
     </w:p>
     <w:p>
       <w:pPr>
+        <w:spacing w:after="40"/>
         <w:jc w:val="right"/>
       </w:pPr>
       <w:r>
@@ -2621,6 +2713,7 @@
     </w:p>
     <w:p>
       <w:pPr>
+        <w:spacing w:after="40"/>
         <w:jc w:val="center"/>
       </w:pPr>
       <w:r>
@@ -2638,6 +2731,7 @@
     </w:p>
     <w:p>
       <w:pPr>
+        <w:spacing w:after="40"/>
         <w:jc w:val="center"/>
       </w:pPr>
       <w:r>
@@ -2657,6 +2751,9 @@
       </w:r>
     </w:p>
     <w:p>
+      <w:pPr>
+        <w:spacing w:after="40"/>
+      </w:pPr>
       <w:r>
         <w:rPr>
           <w:b w:val="0"/>
@@ -2670,6 +2767,7 @@
     </w:p>
     <w:p>
       <w:pPr>
+        <w:spacing w:after="40"/>
         <w:jc w:val="center"/>
       </w:pPr>
       <w:r>
@@ -2684,6 +2782,9 @@
       </w:r>
     </w:p>
     <w:p>
+      <w:pPr>
+        <w:spacing w:after="40"/>
+      </w:pPr>
       <w:r>
         <w:rPr>
           <w:b w:val="0"/>
@@ -2696,6 +2797,9 @@
       </w:r>
     </w:p>
     <w:p>
+      <w:pPr>
+        <w:spacing w:after="40"/>
+      </w:pPr>
       <w:r>
         <w:rPr>
           <w:b w:val="0"/>
@@ -2709,7 +2813,7 @@
     </w:p>
     <w:p>
       <w:pPr>
-        <w:spacing w:before="160" w:after="160"/>
+        <w:spacing w:before="120" w:after="120"/>
         <w:jc w:val="center"/>
       </w:pPr>
     </w:p>
@@ -2726,7 +2830,7 @@
               <a:graphicData uri="http://schemas.openxmlformats.org/drawingml/2006/picture">
                 <pic:pic>
                   <pic:nvPicPr>
-                    <pic:cNvPr id="0" name="chart_2823318173600.png"/>
+                    <pic:cNvPr id="0" name="chart_3212180857120.png"/>
                     <pic:cNvPicPr/>
                   </pic:nvPicPr>
                   <pic:blipFill>
@@ -2750,6 +2854,9 @@
       </w:r>
     </w:p>
     <w:p>
+      <w:pPr>
+        <w:spacing w:after="40"/>
+      </w:pPr>
       <w:r>
         <w:rPr>
           <w:b w:val="0"/>
@@ -2762,6 +2869,9 @@
       </w:r>
     </w:p>
     <w:p>
+      <w:pPr>
+        <w:spacing w:after="40"/>
+      </w:pPr>
       <w:r>
         <w:rPr>
           <w:b w:val="0"/>
@@ -2775,6 +2885,7 @@
     </w:p>
     <w:p>
       <w:pPr>
+        <w:spacing w:after="40"/>
         <w:jc w:val="right"/>
       </w:pPr>
       <w:r>
@@ -2790,6 +2901,7 @@
     </w:p>
     <w:p>
       <w:pPr>
+        <w:spacing w:after="40"/>
         <w:jc w:val="center"/>
       </w:pPr>
       <w:r>
@@ -2807,6 +2919,7 @@
     </w:p>
     <w:p>
       <w:pPr>
+        <w:spacing w:after="40"/>
         <w:jc w:val="center"/>
       </w:pPr>
       <w:r>
@@ -2822,7 +2935,7 @@
     </w:p>
     <w:sectPr>
       <w:pgSz w:w="12240" w:h="15840"/>
-      <w:pgMar w:top="1440" w:right="1800" w:bottom="1440" w:left="1800" w:header="720" w:footer="720" w:gutter="0"/>
+      <w:pgMar w:top="720" w:right="800" w:bottom="720" w:left="800" w:header="720" w:footer="720" w:gutter="0"/>
       <w:cols w:space="720"/>
       <w:docGrid w:linePitch="360"/>
     </w:sectPr>
@@ -3194,7 +3307,7 @@
     <w:qFormat/>
     <w:rsid w:val="00FC693F"/>
     <w:pPr>
-      <w:spacing w:line="276" w:lineRule="auto" w:after="80"/>
+      <w:spacing w:line="252" w:lineRule="auto" w:after="40"/>
     </w:pPr>
     <w:rPr>
       <w:rFonts w:ascii="Calibri" w:hAnsi="Calibri"/>

</xml_diff>